<commit_message>
report faculty name updated
</commit_message>
<xml_diff>
--- a/Fake_Account_Detection_Documentation.docx
+++ b/Fake_Account_Detection_Documentation.docx
@@ -435,27 +435,54 @@
           <w:sz w:val="28"/>
           <w:szCs w:val="28"/>
         </w:rPr>
-        <w:t>Dr. Nandha Kumar K G</w:t>
-      </w:r>
-    </w:p>
-    <w:p>
-      <w:pPr>
-        <w:jc w:val="center"/>
+        <w:t xml:space="preserve">Dr. </w:t>
+      </w:r>
+      <w:r>
         <w:rPr>
           <w:rFonts w:eastAsia="Times New Roman" w:cstheme="minorHAnsi"/>
           <w:b/>
           <w:sz w:val="28"/>
           <w:szCs w:val="28"/>
         </w:rPr>
-      </w:pPr>
-      <w:r>
+        <w:t>Geetha V</w:t>
+      </w:r>
+    </w:p>
+    <w:p>
+      <w:pPr>
+        <w:jc w:val="center"/>
         <w:rPr>
           <w:rFonts w:eastAsia="Times New Roman" w:cstheme="minorHAnsi"/>
           <w:b/>
           <w:sz w:val="28"/>
           <w:szCs w:val="28"/>
         </w:rPr>
-        <w:t>(Assistance Professor-1)</w:t>
+      </w:pPr>
+      <w:r>
+        <w:rPr>
+          <w:rFonts w:eastAsia="Times New Roman" w:cstheme="minorHAnsi"/>
+          <w:b/>
+          <w:sz w:val="28"/>
+          <w:szCs w:val="28"/>
+        </w:rPr>
+        <w:t>(Assistance Professor-</w:t>
+      </w:r>
+      <w:r>
+        <w:rPr>
+          <w:rFonts w:eastAsia="Times New Roman" w:cstheme="minorHAnsi"/>
+          <w:b/>
+          <w:sz w:val="28"/>
+          <w:szCs w:val="28"/>
+        </w:rPr>
+        <w:t>III</w:t>
+      </w:r>
+      <w:r>
+        <w:rPr>
+          <w:rFonts w:eastAsia="Times New Roman" w:cstheme="minorHAnsi"/>
+          <w:b/>
+          <w:sz w:val="28"/>
+          <w:szCs w:val="28"/>
+        </w:rPr>
+        <w:t>)</w:t>
       </w:r>
     </w:p>
     <w:p>
@@ -621,6 +648,18 @@
         <w:rPr>
           <w:rFonts w:eastAsia="Times New Roman" w:cstheme="minorHAnsi"/>
           <w:b/>
+          <w:sz w:val="24"/>
+          <w:szCs w:val="14"/>
+        </w:rPr>
+      </w:pPr>
+    </w:p>
+    <w:p>
+      <w:pPr>
+        <w:spacing w:after="161"/>
+        <w:jc w:val="center"/>
+        <w:rPr>
+          <w:rFonts w:eastAsia="Times New Roman" w:cstheme="minorHAnsi"/>
+          <w:b/>
           <w:sz w:val="40"/>
         </w:rPr>
       </w:pPr>
@@ -684,17 +723,6 @@
         </w:rPr>
         <w:t>, Bangalore – 562110</w:t>
       </w:r>
-    </w:p>
-    <w:p>
-      <w:pPr>
-        <w:jc w:val="center"/>
-        <w:rPr>
-          <w:rFonts w:eastAsia="Times New Roman" w:cstheme="minorHAnsi"/>
-          <w:bCs/>
-          <w:sz w:val="28"/>
-          <w:szCs w:val="16"/>
-        </w:rPr>
-      </w:pPr>
     </w:p>
     <w:p>
       <w:pPr>
@@ -7224,7 +7252,25 @@
                                 <w:sz w:val="24"/>
                                 <w:szCs w:val="24"/>
                               </w:rPr>
-                              <w:t>Graph Construction (NetworkX)</w:t>
+                              <w:t>Graph Construction (</w:t>
+                            </w:r>
+                            <w:proofErr w:type="spellStart"/>
+                            <w:r>
+                              <w:rPr>
+                                <w:color w:val="00B0F0"/>
+                                <w:sz w:val="24"/>
+                                <w:szCs w:val="24"/>
+                              </w:rPr>
+                              <w:t>NetworkX</w:t>
+                            </w:r>
+                            <w:proofErr w:type="spellEnd"/>
+                            <w:r>
+                              <w:rPr>
+                                <w:color w:val="00B0F0"/>
+                                <w:sz w:val="24"/>
+                                <w:szCs w:val="24"/>
+                              </w:rPr>
+                              <w:t>)</w:t>
                             </w:r>
                           </w:p>
                         </w:txbxContent>
@@ -11480,7 +11526,7 @@
         </w:rPr>
         <w:lastRenderedPageBreak/>
         <w:drawing>
-          <wp:anchor distT="0" distB="0" distL="114300" distR="114300" simplePos="0" relativeHeight="251674624" behindDoc="0" locked="0" layoutInCell="1" allowOverlap="1" wp14:anchorId="32003191" wp14:editId="7D444B46">
+          <wp:anchor distT="0" distB="0" distL="114300" distR="114300" simplePos="0" relativeHeight="251674624" behindDoc="0" locked="0" layoutInCell="1" allowOverlap="1" wp14:anchorId="32003191" wp14:editId="16BE4EF9">
             <wp:simplePos x="0" y="0"/>
             <wp:positionH relativeFrom="column">
               <wp:posOffset>193040</wp:posOffset>
@@ -22050,11 +22096,14 @@
   </w:compat>
   <w:rsids>
     <w:rsidRoot w:val="00C903FD"/>
+    <w:rsid w:val="00001A72"/>
     <w:rsid w:val="00044880"/>
     <w:rsid w:val="00150C67"/>
     <w:rsid w:val="00161B43"/>
     <w:rsid w:val="001706BD"/>
     <w:rsid w:val="00171FF2"/>
+    <w:rsid w:val="001A3E89"/>
+    <w:rsid w:val="001C7CDC"/>
     <w:rsid w:val="001D37C7"/>
     <w:rsid w:val="0025132C"/>
     <w:rsid w:val="0026209C"/>
@@ -22102,6 +22151,7 @@
     <w:rsid w:val="00CA35E7"/>
     <w:rsid w:val="00CD364F"/>
     <w:rsid w:val="00D919E3"/>
+    <w:rsid w:val="00DE545E"/>
     <w:rsid w:val="00E10830"/>
     <w:rsid w:val="00E46747"/>
     <w:rsid w:val="00EA2819"/>

</xml_diff>

<commit_message>
redme file + project report updated
</commit_message>
<xml_diff>
--- a/Fake_Account_Detection_Documentation.docx
+++ b/Fake_Account_Detection_Documentation.docx
@@ -4,728 +4,6 @@
   <w:body>
     <w:p>
       <w:pPr>
-        <w:spacing w:after="0"/>
-        <w:jc w:val="center"/>
-        <w:rPr>
-          <w:rFonts w:ascii="Arial Black" w:eastAsia="Times New Roman" w:hAnsi="Arial Black" w:cs="Times New Roman"/>
-          <w:b/>
-          <w:color w:val="002060"/>
-          <w:sz w:val="20"/>
-          <w:szCs w:val="12"/>
-        </w:rPr>
-      </w:pPr>
-      <w:r>
-        <w:rPr>
-          <w:noProof/>
-          <w:lang w:val="en-US"/>
-        </w:rPr>
-        <w:drawing>
-          <wp:anchor distT="0" distB="0" distL="114300" distR="114300" simplePos="0" relativeHeight="251659264" behindDoc="1" locked="0" layoutInCell="1" allowOverlap="1" wp14:anchorId="7652826C" wp14:editId="3733119E">
-            <wp:simplePos x="0" y="0"/>
-            <wp:positionH relativeFrom="column">
-              <wp:posOffset>1257300</wp:posOffset>
-            </wp:positionH>
-            <wp:positionV relativeFrom="paragraph">
-              <wp:posOffset>0</wp:posOffset>
-            </wp:positionV>
-            <wp:extent cx="3236595" cy="1257300"/>
-            <wp:effectExtent l="0" t="0" r="1905" b="0"/>
-            <wp:wrapTopAndBottom/>
-            <wp:docPr id="301288715" name="Picture 1"/>
-            <wp:cNvGraphicFramePr>
-              <a:graphicFrameLocks xmlns:a="http://schemas.openxmlformats.org/drawingml/2006/main" noChangeAspect="1"/>
-            </wp:cNvGraphicFramePr>
-            <a:graphic xmlns:a="http://schemas.openxmlformats.org/drawingml/2006/main">
-              <a:graphicData uri="http://schemas.openxmlformats.org/drawingml/2006/picture">
-                <pic:pic xmlns:pic="http://schemas.openxmlformats.org/drawingml/2006/picture">
-                  <pic:nvPicPr>
-                    <pic:cNvPr id="301288715" name="Picture 301288715"/>
-                    <pic:cNvPicPr/>
-                  </pic:nvPicPr>
-                  <pic:blipFill>
-                    <a:blip r:embed="rId9">
-                      <a:extLst>
-                        <a:ext uri="{28A0092B-C50C-407E-A947-70E740481C1C}">
-                          <a14:useLocalDpi xmlns:a14="http://schemas.microsoft.com/office/drawing/2010/main" val="0"/>
-                        </a:ext>
-                      </a:extLst>
-                    </a:blip>
-                    <a:stretch>
-                      <a:fillRect/>
-                    </a:stretch>
-                  </pic:blipFill>
-                  <pic:spPr>
-                    <a:xfrm>
-                      <a:off x="0" y="0"/>
-                      <a:ext cx="3236595" cy="1257300"/>
-                    </a:xfrm>
-                    <a:prstGeom prst="rect">
-                      <a:avLst/>
-                    </a:prstGeom>
-                  </pic:spPr>
-                </pic:pic>
-              </a:graphicData>
-            </a:graphic>
-            <wp14:sizeRelH relativeFrom="margin">
-              <wp14:pctWidth>0</wp14:pctWidth>
-            </wp14:sizeRelH>
-            <wp14:sizeRelV relativeFrom="margin">
-              <wp14:pctHeight>0</wp14:pctHeight>
-            </wp14:sizeRelV>
-          </wp:anchor>
-        </w:drawing>
-      </w:r>
-    </w:p>
-    <w:p>
-      <w:pPr>
-        <w:spacing w:after="0"/>
-        <w:jc w:val="center"/>
-        <w:rPr>
-          <w:rFonts w:ascii="Arial Black" w:eastAsia="Times New Roman" w:hAnsi="Arial Black" w:cs="Times New Roman"/>
-          <w:b/>
-          <w:color w:val="002060"/>
-          <w:sz w:val="40"/>
-          <w:szCs w:val="20"/>
-        </w:rPr>
-      </w:pPr>
-      <w:r>
-        <w:rPr>
-          <w:rFonts w:ascii="Arial Black" w:eastAsia="Times New Roman" w:hAnsi="Arial Black" w:cs="Times New Roman"/>
-          <w:b/>
-          <w:color w:val="002060"/>
-          <w:sz w:val="40"/>
-          <w:szCs w:val="20"/>
-        </w:rPr>
-        <w:t xml:space="preserve">AMITY INSTITUTE OF </w:t>
-      </w:r>
-    </w:p>
-    <w:p>
-      <w:pPr>
-        <w:spacing w:after="0"/>
-        <w:jc w:val="center"/>
-        <w:rPr>
-          <w:rFonts w:ascii="Arial Black" w:eastAsia="Times New Roman" w:hAnsi="Arial Black" w:cs="Times New Roman"/>
-          <w:b/>
-          <w:color w:val="002060"/>
-          <w:sz w:val="40"/>
-          <w:szCs w:val="20"/>
-        </w:rPr>
-      </w:pPr>
-      <w:r>
-        <w:rPr>
-          <w:rFonts w:ascii="Arial Black" w:eastAsia="Times New Roman" w:hAnsi="Arial Black" w:cs="Times New Roman"/>
-          <w:b/>
-          <w:color w:val="002060"/>
-          <w:sz w:val="40"/>
-          <w:szCs w:val="20"/>
-        </w:rPr>
-        <w:t>INFORMATION</w:t>
-      </w:r>
-      <w:r>
-        <w:rPr>
-          <w:rFonts w:ascii="Arial Black" w:hAnsi="Arial Black"/>
-          <w:color w:val="002060"/>
-          <w:sz w:val="18"/>
-          <w:szCs w:val="20"/>
-        </w:rPr>
-        <w:t xml:space="preserve"> </w:t>
-      </w:r>
-      <w:r>
-        <w:rPr>
-          <w:rFonts w:ascii="Arial Black" w:eastAsia="Times New Roman" w:hAnsi="Arial Black" w:cs="Times New Roman"/>
-          <w:b/>
-          <w:color w:val="002060"/>
-          <w:sz w:val="40"/>
-          <w:szCs w:val="20"/>
-        </w:rPr>
-        <w:t>TECHNOLOGY</w:t>
-      </w:r>
-    </w:p>
-    <w:p>
-      <w:pPr>
-        <w:spacing w:after="0"/>
-        <w:jc w:val="center"/>
-        <w:rPr>
-          <w:rFonts w:ascii="Arial Black" w:eastAsia="Times New Roman" w:hAnsi="Arial Black" w:cs="Times New Roman"/>
-          <w:b/>
-          <w:color w:val="002060"/>
-          <w:sz w:val="40"/>
-          <w:szCs w:val="20"/>
-        </w:rPr>
-      </w:pPr>
-      <w:r>
-        <w:rPr>
-          <w:rFonts w:ascii="Arial Black" w:eastAsia="Times New Roman" w:hAnsi="Arial Black" w:cs="Times New Roman"/>
-          <w:b/>
-          <w:color w:val="002060"/>
-          <w:sz w:val="40"/>
-          <w:szCs w:val="20"/>
-        </w:rPr>
-        <w:t>(AIIT)</w:t>
-      </w:r>
-    </w:p>
-    <w:p>
-      <w:pPr>
-        <w:spacing w:after="0"/>
-        <w:jc w:val="center"/>
-        <w:rPr>
-          <w:rFonts w:ascii="Arial Black" w:hAnsi="Arial Black"/>
-          <w:color w:val="002060"/>
-          <w:sz w:val="20"/>
-          <w:szCs w:val="12"/>
-        </w:rPr>
-      </w:pPr>
-    </w:p>
-    <w:p>
-      <w:pPr>
-        <w:spacing w:after="0"/>
-        <w:jc w:val="center"/>
-        <w:rPr>
-          <w:rFonts w:ascii="Arial Black" w:eastAsia="Times New Roman" w:hAnsi="Arial Black" w:cs="Times New Roman"/>
-          <w:b/>
-          <w:sz w:val="40"/>
-          <w:szCs w:val="40"/>
-        </w:rPr>
-      </w:pPr>
-      <w:bookmarkStart w:id="0" w:name="Slide_2"/>
-      <w:bookmarkEnd w:id="0"/>
-      <w:r>
-        <w:rPr>
-          <w:rFonts w:ascii="Arial Black" w:eastAsia="Times New Roman" w:hAnsi="Arial Black" w:cs="Times New Roman"/>
-          <w:b/>
-          <w:sz w:val="40"/>
-          <w:szCs w:val="40"/>
-        </w:rPr>
-        <w:t>Graph Data Analytics and</w:t>
-      </w:r>
-      <w:r>
-        <w:rPr>
-          <w:rFonts w:ascii="Arial Black" w:eastAsia="Times New Roman" w:hAnsi="Arial Black" w:cs="Times New Roman"/>
-          <w:b/>
-          <w:sz w:val="40"/>
-          <w:szCs w:val="40"/>
-        </w:rPr>
-        <w:t xml:space="preserve"> </w:t>
-      </w:r>
-      <w:r>
-        <w:rPr>
-          <w:rFonts w:ascii="Arial Black" w:eastAsia="Times New Roman" w:hAnsi="Arial Black" w:cs="Times New Roman"/>
-          <w:b/>
-          <w:sz w:val="40"/>
-          <w:szCs w:val="40"/>
-        </w:rPr>
-        <w:t>Representation Learning</w:t>
-      </w:r>
-    </w:p>
-    <w:p>
-      <w:pPr>
-        <w:spacing w:after="0"/>
-        <w:jc w:val="center"/>
-        <w:rPr>
-          <w:rFonts w:ascii="Arial Black" w:eastAsia="Times New Roman" w:hAnsi="Arial Black" w:cs="Times New Roman"/>
-          <w:b/>
-          <w:sz w:val="48"/>
-          <w:szCs w:val="28"/>
-        </w:rPr>
-      </w:pPr>
-      <w:r>
-        <w:rPr>
-          <w:rFonts w:ascii="Arial Black" w:eastAsia="Times New Roman" w:hAnsi="Arial Black" w:cs="Times New Roman"/>
-          <w:b/>
-          <w:sz w:val="40"/>
-          <w:szCs w:val="40"/>
-        </w:rPr>
-        <w:t>(CSE5083)</w:t>
-      </w:r>
-    </w:p>
-    <w:p>
-      <w:pPr>
-        <w:spacing w:after="0"/>
-        <w:jc w:val="center"/>
-        <w:rPr>
-          <w:rFonts w:ascii="Arial Black" w:eastAsia="Times New Roman" w:hAnsi="Arial Black" w:cs="Times New Roman"/>
-          <w:b/>
-          <w:sz w:val="20"/>
-          <w:szCs w:val="20"/>
-        </w:rPr>
-      </w:pPr>
-    </w:p>
-    <w:p>
-      <w:pPr>
-        <w:spacing w:after="0"/>
-        <w:jc w:val="center"/>
-        <w:rPr>
-          <w:rFonts w:ascii="Century Gothic" w:eastAsia="Times New Roman" w:hAnsi="Century Gothic" w:cs="Times New Roman"/>
-          <w:b/>
-          <w:sz w:val="36"/>
-          <w:szCs w:val="20"/>
-        </w:rPr>
-      </w:pPr>
-      <w:r>
-        <w:rPr>
-          <w:rFonts w:ascii="Century Gothic" w:eastAsia="Times New Roman" w:hAnsi="Century Gothic" w:cs="Times New Roman"/>
-          <w:b/>
-          <w:sz w:val="36"/>
-          <w:szCs w:val="20"/>
-        </w:rPr>
-        <w:t>Winter</w:t>
-      </w:r>
-      <w:r>
-        <w:rPr>
-          <w:rFonts w:ascii="Century Gothic" w:eastAsia="Times New Roman" w:hAnsi="Century Gothic" w:cs="Times New Roman"/>
-          <w:b/>
-          <w:sz w:val="36"/>
-          <w:szCs w:val="20"/>
-        </w:rPr>
-        <w:t xml:space="preserve"> Semester – 2025-2026</w:t>
-      </w:r>
-    </w:p>
-    <w:p>
-      <w:pPr>
-        <w:spacing w:after="0"/>
-        <w:jc w:val="center"/>
-        <w:rPr>
-          <w:rFonts w:ascii="Century Gothic" w:eastAsia="Times New Roman" w:hAnsi="Century Gothic" w:cs="Times New Roman"/>
-          <w:b/>
-          <w:sz w:val="20"/>
-          <w:szCs w:val="12"/>
-        </w:rPr>
-      </w:pPr>
-    </w:p>
-    <w:p>
-      <w:pPr>
-        <w:spacing w:after="0"/>
-        <w:jc w:val="center"/>
-        <w:rPr>
-          <w:rFonts w:ascii="Century Gothic" w:eastAsia="Times New Roman" w:hAnsi="Century Gothic" w:cs="Times New Roman"/>
-          <w:b/>
-          <w:sz w:val="32"/>
-          <w:szCs w:val="18"/>
-        </w:rPr>
-      </w:pPr>
-      <w:r>
-        <w:rPr>
-          <w:rFonts w:ascii="Century Gothic" w:eastAsia="Times New Roman" w:hAnsi="Century Gothic" w:cs="Times New Roman"/>
-          <w:b/>
-          <w:sz w:val="32"/>
-          <w:szCs w:val="18"/>
-        </w:rPr>
-        <w:t>Multi-Level Fake Account Detection in Social Networks using Graph Centrality and GNNs</w:t>
-      </w:r>
-    </w:p>
-    <w:p>
-      <w:pPr>
-        <w:spacing w:after="0"/>
-        <w:jc w:val="center"/>
-        <w:rPr>
-          <w:rFonts w:ascii="Century Gothic" w:eastAsia="Times New Roman" w:hAnsi="Century Gothic" w:cs="Times New Roman"/>
-          <w:b/>
-          <w:sz w:val="20"/>
-          <w:szCs w:val="12"/>
-        </w:rPr>
-      </w:pPr>
-    </w:p>
-    <w:p>
-      <w:pPr>
-        <w:spacing w:after="0"/>
-        <w:jc w:val="center"/>
-        <w:rPr>
-          <w:rFonts w:ascii="Century Gothic" w:eastAsia="Times New Roman" w:hAnsi="Century Gothic" w:cs="Times New Roman"/>
-          <w:b/>
-          <w:sz w:val="36"/>
-          <w:szCs w:val="20"/>
-          <w:lang w:val="en-US"/>
-        </w:rPr>
-      </w:pPr>
-      <w:r>
-        <w:rPr>
-          <w:rFonts w:ascii="Century Gothic" w:eastAsia="Times New Roman" w:hAnsi="Century Gothic" w:cs="Times New Roman"/>
-          <w:b/>
-          <w:sz w:val="36"/>
-          <w:szCs w:val="20"/>
-        </w:rPr>
-        <w:t>Project</w:t>
-      </w:r>
-      <w:r>
-        <w:rPr>
-          <w:rFonts w:ascii="Century Gothic" w:eastAsia="Times New Roman" w:hAnsi="Century Gothic" w:cs="Times New Roman"/>
-          <w:b/>
-          <w:sz w:val="36"/>
-          <w:szCs w:val="20"/>
-        </w:rPr>
-        <w:t xml:space="preserve"> Report</w:t>
-      </w:r>
-    </w:p>
-    <w:p>
-      <w:pPr>
-        <w:spacing w:after="0"/>
-        <w:rPr>
-          <w:rFonts w:ascii="Century Gothic" w:eastAsia="Times New Roman" w:hAnsi="Century Gothic" w:cs="Times New Roman"/>
-          <w:b/>
-          <w:sz w:val="40"/>
-          <w:lang w:val="en-US"/>
-        </w:rPr>
-      </w:pPr>
-    </w:p>
-    <w:p>
-      <w:pPr>
-        <w:spacing w:after="0"/>
-        <w:jc w:val="center"/>
-        <w:rPr>
-          <w:rFonts w:ascii="Century Gothic" w:eastAsia="Times New Roman" w:hAnsi="Century Gothic" w:cs="Times New Roman"/>
-          <w:b/>
-          <w:sz w:val="20"/>
-          <w:szCs w:val="20"/>
-          <w:lang w:val="en-US"/>
-        </w:rPr>
-        <w:sectPr>
-          <w:headerReference w:type="default" r:id="rId10"/>
-          <w:footerReference w:type="default" r:id="rId11"/>
-          <w:type w:val="continuous"/>
-          <w:pgSz w:w="11906" w:h="16838"/>
-          <w:pgMar w:top="1440" w:right="1440" w:bottom="1440" w:left="1440" w:header="794" w:footer="720" w:gutter="0"/>
-          <w:pgBorders w:offsetFrom="page">
-            <w:top w:val="double" w:sz="4" w:space="24" w:color="auto"/>
-            <w:left w:val="double" w:sz="4" w:space="24" w:color="auto"/>
-            <w:bottom w:val="double" w:sz="4" w:space="24" w:color="auto"/>
-            <w:right w:val="double" w:sz="4" w:space="24" w:color="auto"/>
-          </w:pgBorders>
-          <w:cols w:space="720"/>
-          <w:titlePg/>
-          <w:docGrid w:linePitch="360"/>
-        </w:sectPr>
-      </w:pPr>
-    </w:p>
-    <w:p>
-      <w:pPr>
-        <w:jc w:val="center"/>
-        <w:rPr>
-          <w:rFonts w:ascii="Century Gothic" w:eastAsia="Times New Roman" w:hAnsi="Century Gothic" w:cs="Times New Roman"/>
-          <w:b/>
-          <w:sz w:val="32"/>
-          <w:szCs w:val="32"/>
-          <w:lang w:val="en-US"/>
-        </w:rPr>
-      </w:pPr>
-      <w:r>
-        <w:rPr>
-          <w:rFonts w:ascii="Century Gothic" w:eastAsia="Times New Roman" w:hAnsi="Century Gothic" w:cs="Times New Roman"/>
-          <w:b/>
-          <w:sz w:val="32"/>
-          <w:szCs w:val="32"/>
-          <w:lang w:val="en-US"/>
-        </w:rPr>
-        <w:t>SUBMITTED TO:</w:t>
-      </w:r>
-    </w:p>
-    <w:p>
-      <w:pPr>
-        <w:jc w:val="center"/>
-        <w:rPr>
-          <w:rFonts w:eastAsia="Times New Roman" w:cstheme="minorHAnsi"/>
-          <w:b/>
-          <w:sz w:val="28"/>
-          <w:szCs w:val="28"/>
-        </w:rPr>
-      </w:pPr>
-      <w:r>
-        <w:rPr>
-          <w:rFonts w:eastAsia="Times New Roman" w:cstheme="minorHAnsi"/>
-          <w:b/>
-          <w:sz w:val="28"/>
-          <w:szCs w:val="28"/>
-        </w:rPr>
-        <w:t xml:space="preserve">Dr. </w:t>
-      </w:r>
-      <w:r>
-        <w:rPr>
-          <w:rFonts w:eastAsia="Times New Roman" w:cstheme="minorHAnsi"/>
-          <w:b/>
-          <w:sz w:val="28"/>
-          <w:szCs w:val="28"/>
-        </w:rPr>
-        <w:t>Geetha V</w:t>
-      </w:r>
-    </w:p>
-    <w:p>
-      <w:pPr>
-        <w:jc w:val="center"/>
-        <w:rPr>
-          <w:rFonts w:eastAsia="Times New Roman" w:cstheme="minorHAnsi"/>
-          <w:b/>
-          <w:sz w:val="28"/>
-          <w:szCs w:val="28"/>
-        </w:rPr>
-      </w:pPr>
-      <w:r>
-        <w:rPr>
-          <w:rFonts w:eastAsia="Times New Roman" w:cstheme="minorHAnsi"/>
-          <w:b/>
-          <w:sz w:val="28"/>
-          <w:szCs w:val="28"/>
-        </w:rPr>
-        <w:t>(Assistance Professor-</w:t>
-      </w:r>
-      <w:r>
-        <w:rPr>
-          <w:rFonts w:eastAsia="Times New Roman" w:cstheme="minorHAnsi"/>
-          <w:b/>
-          <w:sz w:val="28"/>
-          <w:szCs w:val="28"/>
-        </w:rPr>
-        <w:t>III</w:t>
-      </w:r>
-      <w:r>
-        <w:rPr>
-          <w:rFonts w:eastAsia="Times New Roman" w:cstheme="minorHAnsi"/>
-          <w:b/>
-          <w:sz w:val="28"/>
-          <w:szCs w:val="28"/>
-        </w:rPr>
-        <w:t>)</w:t>
-      </w:r>
-    </w:p>
-    <w:p>
-      <w:pPr>
-        <w:spacing w:after="0"/>
-        <w:jc w:val="center"/>
-        <w:rPr>
-          <w:rFonts w:eastAsia="Times New Roman" w:cstheme="minorHAnsi"/>
-          <w:b/>
-          <w:sz w:val="28"/>
-          <w:szCs w:val="28"/>
-        </w:rPr>
-      </w:pPr>
-      <w:r>
-        <w:rPr>
-          <w:rFonts w:eastAsia="Times New Roman" w:cstheme="minorHAnsi"/>
-          <w:b/>
-          <w:sz w:val="28"/>
-          <w:szCs w:val="28"/>
-        </w:rPr>
-        <w:t>(</w:t>
-      </w:r>
-      <w:r>
-        <w:rPr>
-          <w:rFonts w:eastAsia="Times New Roman" w:cstheme="minorHAnsi"/>
-          <w:b/>
-          <w:sz w:val="28"/>
-          <w:szCs w:val="28"/>
-        </w:rPr>
-        <w:t>AIIT</w:t>
-      </w:r>
-      <w:r>
-        <w:rPr>
-          <w:rFonts w:eastAsia="Times New Roman" w:cstheme="minorHAnsi"/>
-          <w:b/>
-          <w:sz w:val="28"/>
-          <w:szCs w:val="28"/>
-        </w:rPr>
-        <w:t>)</w:t>
-      </w:r>
-    </w:p>
-    <w:p>
-      <w:pPr>
-        <w:spacing w:after="0"/>
-        <w:jc w:val="center"/>
-        <w:rPr>
-          <w:rFonts w:eastAsia="Times New Roman" w:cstheme="minorHAnsi"/>
-          <w:b/>
-          <w:sz w:val="28"/>
-          <w:szCs w:val="28"/>
-        </w:rPr>
-      </w:pPr>
-    </w:p>
-    <w:p>
-      <w:pPr>
-        <w:jc w:val="center"/>
-        <w:rPr>
-          <w:rFonts w:ascii="Century Gothic" w:eastAsia="Times New Roman" w:hAnsi="Century Gothic" w:cs="Times New Roman"/>
-          <w:b/>
-          <w:sz w:val="28"/>
-          <w:szCs w:val="28"/>
-          <w:lang w:val="en-US"/>
-        </w:rPr>
-      </w:pPr>
-      <w:r>
-        <w:rPr>
-          <w:rFonts w:ascii="Century Gothic" w:eastAsia="Times New Roman" w:hAnsi="Century Gothic" w:cs="Times New Roman"/>
-          <w:b/>
-          <w:sz w:val="32"/>
-          <w:szCs w:val="32"/>
-          <w:lang w:val="en-US"/>
-        </w:rPr>
-        <w:t>SUBMITTED BY:</w:t>
-      </w:r>
-    </w:p>
-    <w:p>
-      <w:pPr>
-        <w:jc w:val="center"/>
-        <w:rPr>
-          <w:rFonts w:eastAsia="Times New Roman" w:cstheme="minorHAnsi"/>
-          <w:b/>
-          <w:sz w:val="28"/>
-          <w:szCs w:val="28"/>
-        </w:rPr>
-      </w:pPr>
-      <w:r>
-        <w:rPr>
-          <w:rFonts w:eastAsia="Times New Roman" w:cstheme="minorHAnsi"/>
-          <w:b/>
-          <w:sz w:val="28"/>
-          <w:szCs w:val="28"/>
-        </w:rPr>
-        <w:t>Krishnam Mavani</w:t>
-      </w:r>
-    </w:p>
-    <w:p>
-      <w:pPr>
-        <w:jc w:val="center"/>
-        <w:rPr>
-          <w:rFonts w:eastAsia="Times New Roman" w:cstheme="minorHAnsi"/>
-          <w:b/>
-          <w:sz w:val="28"/>
-          <w:szCs w:val="28"/>
-        </w:rPr>
-      </w:pPr>
-      <w:r>
-        <w:rPr>
-          <w:rFonts w:eastAsia="Times New Roman" w:cstheme="minorHAnsi"/>
-          <w:b/>
-          <w:sz w:val="28"/>
-          <w:szCs w:val="28"/>
-        </w:rPr>
-        <w:t>(</w:t>
-      </w:r>
-      <w:r>
-        <w:rPr>
-          <w:rFonts w:eastAsia="Times New Roman" w:cstheme="minorHAnsi"/>
-          <w:b/>
-          <w:sz w:val="28"/>
-          <w:szCs w:val="28"/>
-        </w:rPr>
-        <w:t>MSc Data Science)</w:t>
-      </w:r>
-    </w:p>
-    <w:p>
-      <w:pPr>
-        <w:jc w:val="center"/>
-        <w:rPr>
-          <w:rFonts w:eastAsia="Times New Roman" w:cstheme="minorHAnsi"/>
-          <w:b/>
-          <w:sz w:val="28"/>
-          <w:szCs w:val="28"/>
-        </w:rPr>
-        <w:sectPr>
-          <w:type w:val="continuous"/>
-          <w:pgSz w:w="11906" w:h="16838"/>
-          <w:pgMar w:top="1440" w:right="1440" w:bottom="1440" w:left="1440" w:header="794" w:footer="720" w:gutter="0"/>
-          <w:pgBorders w:offsetFrom="page">
-            <w:top w:val="double" w:sz="4" w:space="24" w:color="auto"/>
-            <w:left w:val="double" w:sz="4" w:space="24" w:color="auto"/>
-            <w:bottom w:val="double" w:sz="4" w:space="24" w:color="auto"/>
-            <w:right w:val="double" w:sz="4" w:space="24" w:color="auto"/>
-          </w:pgBorders>
-          <w:cols w:num="2" w:space="720"/>
-          <w:titlePg/>
-          <w:docGrid w:linePitch="360"/>
-        </w:sectPr>
-      </w:pPr>
-      <w:r>
-        <w:rPr>
-          <w:rFonts w:eastAsia="Times New Roman" w:cstheme="minorHAnsi"/>
-          <w:b/>
-          <w:sz w:val="28"/>
-          <w:szCs w:val="28"/>
-        </w:rPr>
-        <w:t>(A869117725001)</w:t>
-      </w:r>
-    </w:p>
-    <w:p>
-      <w:pPr>
-        <w:spacing w:after="161"/>
-        <w:jc w:val="center"/>
-        <w:rPr>
-          <w:rFonts w:eastAsia="Times New Roman" w:cstheme="minorHAnsi"/>
-          <w:b/>
-          <w:sz w:val="24"/>
-          <w:szCs w:val="14"/>
-        </w:rPr>
-      </w:pPr>
-    </w:p>
-    <w:p>
-      <w:pPr>
-        <w:spacing w:after="161"/>
-        <w:jc w:val="center"/>
-        <w:rPr>
-          <w:rFonts w:eastAsia="Times New Roman" w:cstheme="minorHAnsi"/>
-          <w:b/>
-          <w:sz w:val="40"/>
-        </w:rPr>
-      </w:pPr>
-      <w:r>
-        <w:rPr>
-          <w:rFonts w:eastAsia="Times New Roman" w:cstheme="minorHAnsi"/>
-          <w:b/>
-          <w:sz w:val="40"/>
-        </w:rPr>
-        <w:t>Amity University Bengaluru</w:t>
-      </w:r>
-    </w:p>
-    <w:p>
-      <w:pPr>
-        <w:spacing w:after="161"/>
-        <w:jc w:val="center"/>
-        <w:rPr>
-          <w:rFonts w:eastAsia="Times New Roman" w:cstheme="minorHAnsi"/>
-          <w:bCs/>
-          <w:sz w:val="28"/>
-          <w:szCs w:val="16"/>
-        </w:rPr>
-      </w:pPr>
-      <w:r>
-        <w:rPr>
-          <w:rFonts w:eastAsia="Times New Roman" w:cstheme="minorHAnsi"/>
-          <w:bCs/>
-          <w:sz w:val="28"/>
-          <w:szCs w:val="16"/>
-        </w:rPr>
-        <w:t xml:space="preserve">NH-207, opposite to the office of Deputy Commissioner, Devanahalli, </w:t>
-      </w:r>
-    </w:p>
-    <w:p>
-      <w:pPr>
-        <w:jc w:val="center"/>
-        <w:rPr>
-          <w:rFonts w:eastAsia="Times New Roman" w:cstheme="minorHAnsi"/>
-          <w:bCs/>
-          <w:sz w:val="28"/>
-          <w:szCs w:val="16"/>
-        </w:rPr>
-      </w:pPr>
-      <w:proofErr w:type="spellStart"/>
-      <w:r>
-        <w:rPr>
-          <w:rFonts w:eastAsia="Times New Roman" w:cstheme="minorHAnsi"/>
-          <w:bCs/>
-          <w:sz w:val="28"/>
-          <w:szCs w:val="16"/>
-        </w:rPr>
-        <w:t>Doddaballapura</w:t>
-      </w:r>
-      <w:proofErr w:type="spellEnd"/>
-      <w:r>
-        <w:rPr>
-          <w:rFonts w:eastAsia="Times New Roman" w:cstheme="minorHAnsi"/>
-          <w:bCs/>
-          <w:sz w:val="28"/>
-          <w:szCs w:val="16"/>
-        </w:rPr>
-        <w:t>, Bangalore – 562110</w:t>
-      </w:r>
-    </w:p>
-    <w:p>
-      <w:pPr>
         <w:spacing w:after="0" w:line="240" w:lineRule="auto"/>
         <w:rPr>
           <w:rFonts w:ascii="Tisa Offc Serif Pro" w:eastAsiaTheme="majorEastAsia" w:hAnsi="Tisa Offc Serif Pro" w:cs="Times New Roman"/>
@@ -747,7 +25,6 @@
           <w:sz w:val="36"/>
           <w:szCs w:val="36"/>
         </w:rPr>
-        <w:lastRenderedPageBreak/>
         <w:t>Multi-Level Fake Account Detection in Social Networks using Graph Centrality and GNNs</w:t>
       </w:r>
     </w:p>
@@ -7314,7 +6591,25 @@
                           <w:sz w:val="24"/>
                           <w:szCs w:val="24"/>
                         </w:rPr>
-                        <w:t>Graph Construction (NetworkX)</w:t>
+                        <w:t>Graph Construction (</w:t>
+                      </w:r>
+                      <w:proofErr w:type="spellStart"/>
+                      <w:r>
+                        <w:rPr>
+                          <w:color w:val="00B0F0"/>
+                          <w:sz w:val="24"/>
+                          <w:szCs w:val="24"/>
+                        </w:rPr>
+                        <w:t>NetworkX</w:t>
+                      </w:r>
+                      <w:proofErr w:type="spellEnd"/>
+                      <w:r>
+                        <w:rPr>
+                          <w:color w:val="00B0F0"/>
+                          <w:sz w:val="24"/>
+                          <w:szCs w:val="24"/>
+                        </w:rPr>
+                        <w:t>)</w:t>
                       </w:r>
                     </w:p>
                   </w:txbxContent>
@@ -11365,7 +10660,7 @@
                     </pic:cNvPicPr>
                   </pic:nvPicPr>
                   <pic:blipFill>
-                    <a:blip r:embed="rId12" cstate="print">
+                    <a:blip r:embed="rId9" cstate="print">
                       <a:extLst>
                         <a:ext uri="{28A0092B-C50C-407E-A947-70E740481C1C}">
                           <a14:useLocalDpi xmlns:a14="http://schemas.microsoft.com/office/drawing/2010/main" val="0"/>
@@ -11526,7 +10821,7 @@
         </w:rPr>
         <w:lastRenderedPageBreak/>
         <w:drawing>
-          <wp:anchor distT="0" distB="0" distL="114300" distR="114300" simplePos="0" relativeHeight="251674624" behindDoc="0" locked="0" layoutInCell="1" allowOverlap="1" wp14:anchorId="32003191" wp14:editId="16BE4EF9">
+          <wp:anchor distT="0" distB="0" distL="114300" distR="114300" simplePos="0" relativeHeight="251674624" behindDoc="0" locked="0" layoutInCell="1" allowOverlap="1" wp14:anchorId="32003191" wp14:editId="704F721A">
             <wp:simplePos x="0" y="0"/>
             <wp:positionH relativeFrom="column">
               <wp:posOffset>193040</wp:posOffset>
@@ -11551,7 +10846,7 @@
                     </pic:cNvPicPr>
                   </pic:nvPicPr>
                   <pic:blipFill>
-                    <a:blip r:embed="rId13" cstate="print">
+                    <a:blip r:embed="rId10" cstate="print">
                       <a:extLst>
                         <a:ext uri="{28A0092B-C50C-407E-A947-70E740481C1C}">
                           <a14:useLocalDpi xmlns:a14="http://schemas.microsoft.com/office/drawing/2010/main" val="0"/>
@@ -11651,7 +10946,7 @@
                     </pic:cNvPicPr>
                   </pic:nvPicPr>
                   <pic:blipFill>
-                    <a:blip r:embed="rId14" cstate="print">
+                    <a:blip r:embed="rId11" cstate="print">
                       <a:extLst>
                         <a:ext uri="{28A0092B-C50C-407E-A947-70E740481C1C}">
                           <a14:useLocalDpi xmlns:a14="http://schemas.microsoft.com/office/drawing/2010/main" val="0"/>
@@ -11756,7 +11051,7 @@
                     </pic:cNvPicPr>
                   </pic:nvPicPr>
                   <pic:blipFill>
-                    <a:blip r:embed="rId15" cstate="print">
+                    <a:blip r:embed="rId12" cstate="print">
                       <a:extLst>
                         <a:ext uri="{28A0092B-C50C-407E-A947-70E740481C1C}">
                           <a14:useLocalDpi xmlns:a14="http://schemas.microsoft.com/office/drawing/2010/main" val="0"/>
@@ -11826,7 +11121,7 @@
                     </pic:cNvPicPr>
                   </pic:nvPicPr>
                   <pic:blipFill>
-                    <a:blip r:embed="rId16" cstate="print">
+                    <a:blip r:embed="rId13" cstate="print">
                       <a:extLst>
                         <a:ext uri="{28A0092B-C50C-407E-A947-70E740481C1C}">
                           <a14:useLocalDpi xmlns:a14="http://schemas.microsoft.com/office/drawing/2010/main" val="0"/>
@@ -12105,17 +11400,7 @@
                           <w:sz w:val="18"/>
                           <w:szCs w:val="18"/>
                         </w:rPr>
-                        <w:t>L</w:t>
-                      </w:r>
-                      <w:r>
-                        <w:rPr>
-                          <w:rFonts w:ascii="Segoe UI Emoji" w:hAnsi="Segoe UI Emoji" w:cs="Segoe UI Emoji"/>
-                          <w:b/>
-                          <w:bCs/>
-                          <w:sz w:val="18"/>
-                          <w:szCs w:val="18"/>
-                        </w:rPr>
-                        <w:t>egend</w:t>
+                        <w:t>Legend</w:t>
                       </w:r>
                     </w:p>
                     <w:p>
@@ -12217,7 +11502,7 @@
                     </pic:cNvPicPr>
                   </pic:nvPicPr>
                   <pic:blipFill>
-                    <a:blip r:embed="rId17" cstate="print">
+                    <a:blip r:embed="rId14" cstate="print">
                       <a:extLst>
                         <a:ext uri="{28A0092B-C50C-407E-A947-70E740481C1C}">
                           <a14:useLocalDpi xmlns:a14="http://schemas.microsoft.com/office/drawing/2010/main" val="0"/>
@@ -12537,7 +11822,7 @@
         </w:rPr>
         <w:t xml:space="preserve">. </w:t>
       </w:r>
-      <w:hyperlink r:id="rId18" w:history="1">
+      <w:hyperlink r:id="rId15" w:history="1">
         <w:r>
           <w:rPr>
             <w:rStyle w:val="Hyperlink"/>
@@ -12668,7 +11953,7 @@
         </w:rPr>
         <w:t xml:space="preserve">. </w:t>
       </w:r>
-      <w:hyperlink r:id="rId19" w:tgtFrame="_new" w:history="1">
+      <w:hyperlink r:id="rId16" w:tgtFrame="_new" w:history="1">
         <w:r>
           <w:rPr>
             <w:rStyle w:val="Hyperlink"/>
@@ -12786,7 +12071,7 @@
         </w:rPr>
         <w:t xml:space="preserve">, 2016. </w:t>
       </w:r>
-      <w:hyperlink r:id="rId20" w:tgtFrame="_new" w:history="1">
+      <w:hyperlink r:id="rId17" w:tgtFrame="_new" w:history="1">
         <w:r>
           <w:rPr>
             <w:rStyle w:val="Hyperlink"/>
@@ -12915,7 +12200,7 @@
         </w:rPr>
         <w:t xml:space="preserve"> </w:t>
       </w:r>
-      <w:hyperlink r:id="rId21" w:tgtFrame="_new" w:history="1">
+      <w:hyperlink r:id="rId18" w:tgtFrame="_new" w:history="1">
         <w:r>
           <w:rPr>
             <w:rStyle w:val="Hyperlink"/>
@@ -13087,7 +12372,7 @@
         </w:rPr>
         <w:t xml:space="preserve"> </w:t>
       </w:r>
-      <w:hyperlink r:id="rId22" w:tgtFrame="_new" w:history="1">
+      <w:hyperlink r:id="rId19" w:tgtFrame="_new" w:history="1">
         <w:r>
           <w:rPr>
             <w:rStyle w:val="Hyperlink"/>
@@ -13248,7 +12533,7 @@
         </w:rPr>
         <w:t xml:space="preserve">. </w:t>
       </w:r>
-      <w:hyperlink r:id="rId23" w:tgtFrame="_new" w:history="1">
+      <w:hyperlink r:id="rId20" w:tgtFrame="_new" w:history="1">
         <w:r>
           <w:rPr>
             <w:rStyle w:val="Hyperlink"/>
@@ -13407,7 +12692,7 @@
         </w:rPr>
         <w:t xml:space="preserve"> </w:t>
       </w:r>
-      <w:hyperlink r:id="rId24" w:tgtFrame="_new" w:history="1">
+      <w:hyperlink r:id="rId21" w:tgtFrame="_new" w:history="1">
         <w:r>
           <w:rPr>
             <w:rStyle w:val="Hyperlink"/>
@@ -13512,7 +12797,7 @@
         </w:rPr>
         <w:t xml:space="preserve">  </w:t>
       </w:r>
-      <w:hyperlink r:id="rId25" w:tgtFrame="_new" w:history="1">
+      <w:hyperlink r:id="rId22" w:tgtFrame="_new" w:history="1">
         <w:r>
           <w:rPr>
             <w:rStyle w:val="Hyperlink"/>
@@ -13641,7 +12926,7 @@
         </w:rPr>
         <w:t xml:space="preserve"> </w:t>
       </w:r>
-      <w:hyperlink r:id="rId26" w:tgtFrame="_new" w:history="1">
+      <w:hyperlink r:id="rId23" w:tgtFrame="_new" w:history="1">
         <w:r>
           <w:rPr>
             <w:rStyle w:val="Hyperlink"/>
@@ -13757,7 +13042,7 @@
         </w:rPr>
         <w:t xml:space="preserve">. </w:t>
       </w:r>
-      <w:hyperlink r:id="rId27" w:tgtFrame="_new" w:history="1">
+      <w:hyperlink r:id="rId24" w:tgtFrame="_new" w:history="1">
         <w:r>
           <w:rPr>
             <w:rStyle w:val="Hyperlink"/>
@@ -13781,7 +13066,12 @@
       </w:pPr>
     </w:p>
     <w:sectPr>
-      <w:headerReference w:type="default" r:id="rId28"/>
+      <w:headerReference w:type="even" r:id="rId25"/>
+      <w:headerReference w:type="default" r:id="rId26"/>
+      <w:footerReference w:type="even" r:id="rId27"/>
+      <w:footerReference w:type="default" r:id="rId28"/>
+      <w:headerReference w:type="first" r:id="rId29"/>
+      <w:footerReference w:type="first" r:id="rId30"/>
       <w:type w:val="continuous"/>
       <w:pgSz w:w="11906" w:h="16838"/>
       <w:pgMar w:top="1440" w:right="1440" w:bottom="1440" w:left="1440" w:header="794" w:footer="720" w:gutter="0"/>
@@ -13792,7 +13082,6 @@
         <w:right w:val="double" w:sz="4" w:space="24" w:color="auto"/>
       </w:pgBorders>
       <w:cols w:space="720"/>
-      <w:titlePg/>
       <w:docGrid w:linePitch="360"/>
     </w:sectPr>
   </w:body>
@@ -13828,6 +13117,16 @@
 <w:ftr xmlns:wpc="http://schemas.microsoft.com/office/word/2010/wordprocessingCanvas" xmlns:cx="http://schemas.microsoft.com/office/drawing/2014/chartex" xmlns:cx1="http://schemas.microsoft.com/office/drawing/2015/9/8/chartex" xmlns:cx2="http://schemas.microsoft.com/office/drawing/2015/10/21/chartex" xmlns:cx3="http://schemas.microsoft.com/office/drawing/2016/5/9/chartex" xmlns:cx4="http://schemas.microsoft.com/office/drawing/2016/5/10/chartex" xmlns:cx5="http://schemas.microsoft.com/office/drawing/2016/5/11/chartex" xmlns:cx6="http://schemas.microsoft.com/office/drawing/2016/5/12/chartex" xmlns:cx7="http://schemas.microsoft.com/office/drawing/2016/5/13/chartex" xmlns:cx8="http://schemas.microsoft.com/office/drawing/2016/5/14/chartex" xmlns:mc="http://schemas.openxmlformats.org/markup-compatibility/2006" xmlns:aink="http://schemas.microsoft.com/office/drawing/2016/ink" xmlns:am3d="http://schemas.microsoft.com/office/drawing/2017/model3d" xmlns:o="urn:schemas-microsoft-com:office:office" xmlns:oel="http://schemas.microsoft.com/office/2019/extlst" xmlns:r="http://schemas.openxmlformats.org/officeDocument/2006/relationships" xmlns:m="http://schemas.openxmlformats.org/officeDocument/2006/math" xmlns:v="urn:schemas-microsoft-com:vml" xmlns:wp14="http://schemas.microsoft.com/office/word/2010/wordprocessingDrawing" xmlns:wp="http://schemas.openxmlformats.org/drawingml/2006/wordprocessingDrawing" xmlns:w10="urn:schemas-microsoft-com:office:word" xmlns:w="http://schemas.openxmlformats.org/wordprocessingml/2006/main" xmlns:w14="http://schemas.microsoft.com/office/word/2010/wordml" xmlns:w15="http://schemas.microsoft.com/office/word/2012/wordml" xmlns:w16cex="http://schemas.microsoft.com/office/word/2018/wordml/cex" xmlns:w16cid="http://schemas.microsoft.com/office/word/2016/wordml/cid" xmlns:w16="http://schemas.microsoft.com/office/word/2018/wordml" xmlns:w16du="http://schemas.microsoft.com/office/word/2023/wordml/word16du" xmlns:w16sdtdh="http://schemas.microsoft.com/office/word/2020/wordml/sdtdatahash" xmlns:w16sdtfl="http://schemas.microsoft.com/office/word/2024/wordml/sdtformatlock" xmlns:w16se="http://schemas.microsoft.com/office/word/2015/wordml/symex" xmlns:wpg="http://schemas.microsoft.com/office/word/2010/wordprocessingGroup" xmlns:wpi="http://schemas.microsoft.com/office/word/2010/wordprocessingInk" xmlns:wne="http://schemas.microsoft.com/office/word/2006/wordml" xmlns:wps="http://schemas.microsoft.com/office/word/2010/wordprocessingShape" mc:Ignorable="w14 w15 w16se w16cid w16 w16cex w16sdtdh w16sdtfl w16du wp14">
   <w:p>
     <w:pPr>
+      <w:pStyle w:val="Footer"/>
+    </w:pPr>
+  </w:p>
+</w:ftr>
+</file>
+
+<file path=word/footer2.xml><?xml version="1.0" encoding="utf-8"?>
+<w:ftr xmlns:wpc="http://schemas.microsoft.com/office/word/2010/wordprocessingCanvas" xmlns:cx="http://schemas.microsoft.com/office/drawing/2014/chartex" xmlns:cx1="http://schemas.microsoft.com/office/drawing/2015/9/8/chartex" xmlns:cx2="http://schemas.microsoft.com/office/drawing/2015/10/21/chartex" xmlns:cx3="http://schemas.microsoft.com/office/drawing/2016/5/9/chartex" xmlns:cx4="http://schemas.microsoft.com/office/drawing/2016/5/10/chartex" xmlns:cx5="http://schemas.microsoft.com/office/drawing/2016/5/11/chartex" xmlns:cx6="http://schemas.microsoft.com/office/drawing/2016/5/12/chartex" xmlns:cx7="http://schemas.microsoft.com/office/drawing/2016/5/13/chartex" xmlns:cx8="http://schemas.microsoft.com/office/drawing/2016/5/14/chartex" xmlns:mc="http://schemas.openxmlformats.org/markup-compatibility/2006" xmlns:aink="http://schemas.microsoft.com/office/drawing/2016/ink" xmlns:am3d="http://schemas.microsoft.com/office/drawing/2017/model3d" xmlns:o="urn:schemas-microsoft-com:office:office" xmlns:oel="http://schemas.microsoft.com/office/2019/extlst" xmlns:r="http://schemas.openxmlformats.org/officeDocument/2006/relationships" xmlns:m="http://schemas.openxmlformats.org/officeDocument/2006/math" xmlns:v="urn:schemas-microsoft-com:vml" xmlns:wp14="http://schemas.microsoft.com/office/word/2010/wordprocessingDrawing" xmlns:wp="http://schemas.openxmlformats.org/drawingml/2006/wordprocessingDrawing" xmlns:w10="urn:schemas-microsoft-com:office:word" xmlns:w="http://schemas.openxmlformats.org/wordprocessingml/2006/main" xmlns:w14="http://schemas.microsoft.com/office/word/2010/wordml" xmlns:w15="http://schemas.microsoft.com/office/word/2012/wordml" xmlns:w16cex="http://schemas.microsoft.com/office/word/2018/wordml/cex" xmlns:w16cid="http://schemas.microsoft.com/office/word/2016/wordml/cid" xmlns:w16="http://schemas.microsoft.com/office/word/2018/wordml" xmlns:w16du="http://schemas.microsoft.com/office/word/2023/wordml/word16du" xmlns:w16sdtdh="http://schemas.microsoft.com/office/word/2020/wordml/sdtdatahash" xmlns:w16sdtfl="http://schemas.microsoft.com/office/word/2024/wordml/sdtformatlock" xmlns:w16se="http://schemas.microsoft.com/office/word/2015/wordml/symex" xmlns:wpg="http://schemas.microsoft.com/office/word/2010/wordprocessingGroup" xmlns:wpi="http://schemas.microsoft.com/office/word/2010/wordprocessingInk" xmlns:wne="http://schemas.microsoft.com/office/word/2006/wordml" xmlns:wps="http://schemas.microsoft.com/office/word/2010/wordprocessingShape" mc:Ignorable="w14 w15 w16se w16cid w16 w16cex w16sdtdh w16sdtfl w16du wp14">
+  <w:p>
+    <w:pPr>
       <w:tabs>
         <w:tab w:val="center" w:pos="4550"/>
         <w:tab w:val="left" w:pos="5818"/>
@@ -13836,54 +13135,85 @@
       <w:jc w:val="right"/>
       <w:rPr>
         <w:rFonts w:ascii="Cambria" w:hAnsi="Cambria"/>
-        <w:color w:val="000000" w:themeColor="text1"/>
-        <w:sz w:val="24"/>
-        <w:szCs w:val="24"/>
+        <w:color w:val="747474" w:themeColor="background2" w:themeShade="80"/>
       </w:rPr>
     </w:pPr>
     <w:r>
       <w:rPr>
         <w:rFonts w:ascii="Cambria" w:hAnsi="Cambria"/>
-        <w:color w:val="000000" w:themeColor="text1"/>
+        <w:color w:val="747474" w:themeColor="background2" w:themeShade="80"/>
         <w:spacing w:val="60"/>
-        <w:sz w:val="24"/>
-        <w:szCs w:val="24"/>
       </w:rPr>
       <w:t>Page</w:t>
     </w:r>
     <w:r>
       <w:rPr>
         <w:rFonts w:ascii="Cambria" w:hAnsi="Cambria"/>
-        <w:color w:val="000000" w:themeColor="text1"/>
-        <w:sz w:val="24"/>
-        <w:szCs w:val="24"/>
+        <w:color w:val="747474" w:themeColor="background2" w:themeShade="80"/>
+      </w:rPr>
+      <w:t xml:space="preserve"> </w:t>
+    </w:r>
+    <w:r>
+      <w:rPr>
+        <w:rFonts w:ascii="Cambria" w:hAnsi="Cambria"/>
+        <w:color w:val="747474" w:themeColor="background2" w:themeShade="80"/>
+      </w:rPr>
+      <w:fldChar w:fldCharType="begin"/>
+    </w:r>
+    <w:r>
+      <w:rPr>
+        <w:rFonts w:ascii="Cambria" w:hAnsi="Cambria"/>
+        <w:color w:val="747474" w:themeColor="background2" w:themeShade="80"/>
+      </w:rPr>
+      <w:instrText xml:space="preserve"> PAGE   \* MERGEFORMAT </w:instrText>
+    </w:r>
+    <w:r>
+      <w:rPr>
+        <w:rFonts w:ascii="Cambria" w:hAnsi="Cambria"/>
+        <w:color w:val="747474" w:themeColor="background2" w:themeShade="80"/>
+      </w:rPr>
+      <w:fldChar w:fldCharType="separate"/>
+    </w:r>
+    <w:r>
+      <w:rPr>
+        <w:rFonts w:ascii="Cambria" w:hAnsi="Cambria"/>
+        <w:noProof/>
+        <w:color w:val="747474" w:themeColor="background2" w:themeShade="80"/>
+      </w:rPr>
+      <w:t>1</w:t>
+    </w:r>
+    <w:r>
+      <w:rPr>
+        <w:rFonts w:ascii="Cambria" w:hAnsi="Cambria"/>
+        <w:color w:val="747474" w:themeColor="background2" w:themeShade="80"/>
+      </w:rPr>
+      <w:fldChar w:fldCharType="end"/>
+    </w:r>
+    <w:r>
+      <w:rPr>
+        <w:rFonts w:ascii="Cambria" w:hAnsi="Cambria"/>
+        <w:color w:val="747474" w:themeColor="background2" w:themeShade="80"/>
       </w:rPr>
       <w:t xml:space="preserve"> | </w:t>
     </w:r>
     <w:r>
       <w:rPr>
         <w:rFonts w:ascii="Cambria" w:hAnsi="Cambria"/>
-        <w:color w:val="000000" w:themeColor="text1"/>
-        <w:sz w:val="24"/>
-        <w:szCs w:val="24"/>
+        <w:color w:val="747474" w:themeColor="background2" w:themeShade="80"/>
       </w:rPr>
       <w:fldChar w:fldCharType="begin"/>
     </w:r>
     <w:r>
       <w:rPr>
         <w:rFonts w:ascii="Cambria" w:hAnsi="Cambria"/>
-        <w:color w:val="000000" w:themeColor="text1"/>
-        <w:sz w:val="24"/>
-        <w:szCs w:val="24"/>
-      </w:rPr>
-      <w:instrText xml:space="preserve"> PAGE   \* MERGEFORMAT </w:instrText>
+        <w:color w:val="747474" w:themeColor="background2" w:themeShade="80"/>
+      </w:rPr>
+      <w:instrText xml:space="preserve"> NUMPAGES  \* Arabic  \* MERGEFORMAT </w:instrText>
     </w:r>
     <w:r>
       <w:rPr>
         <w:rFonts w:ascii="Cambria" w:hAnsi="Cambria"/>
-        <w:color w:val="000000" w:themeColor="text1"/>
-        <w:sz w:val="24"/>
-        <w:szCs w:val="24"/>
+        <w:color w:val="747474" w:themeColor="background2" w:themeShade="80"/>
       </w:rPr>
       <w:fldChar w:fldCharType="separate"/>
     </w:r>
@@ -13891,18 +13221,14 @@
       <w:rPr>
         <w:rFonts w:ascii="Cambria" w:hAnsi="Cambria"/>
         <w:noProof/>
-        <w:color w:val="000000" w:themeColor="text1"/>
-        <w:sz w:val="24"/>
-        <w:szCs w:val="24"/>
+        <w:color w:val="747474" w:themeColor="background2" w:themeShade="80"/>
       </w:rPr>
       <w:t>1</w:t>
     </w:r>
     <w:r>
       <w:rPr>
         <w:rFonts w:ascii="Cambria" w:hAnsi="Cambria"/>
-        <w:color w:val="000000" w:themeColor="text1"/>
-        <w:sz w:val="24"/>
-        <w:szCs w:val="24"/>
+        <w:color w:val="747474" w:themeColor="background2" w:themeShade="80"/>
       </w:rPr>
       <w:fldChar w:fldCharType="end"/>
     </w:r>
@@ -13912,8 +13238,20 @@
       <w:pStyle w:val="Footer"/>
       <w:rPr>
         <w:rFonts w:ascii="Cambria" w:hAnsi="Cambria"/>
-        <w:color w:val="000000" w:themeColor="text1"/>
-      </w:rPr>
+        <w:color w:val="747474" w:themeColor="background2" w:themeShade="80"/>
+        <w:sz w:val="20"/>
+        <w:szCs w:val="20"/>
+      </w:rPr>
+    </w:pPr>
+  </w:p>
+</w:ftr>
+</file>
+
+<file path=word/footer3.xml><?xml version="1.0" encoding="utf-8"?>
+<w:ftr xmlns:wpc="http://schemas.microsoft.com/office/word/2010/wordprocessingCanvas" xmlns:cx="http://schemas.microsoft.com/office/drawing/2014/chartex" xmlns:cx1="http://schemas.microsoft.com/office/drawing/2015/9/8/chartex" xmlns:cx2="http://schemas.microsoft.com/office/drawing/2015/10/21/chartex" xmlns:cx3="http://schemas.microsoft.com/office/drawing/2016/5/9/chartex" xmlns:cx4="http://schemas.microsoft.com/office/drawing/2016/5/10/chartex" xmlns:cx5="http://schemas.microsoft.com/office/drawing/2016/5/11/chartex" xmlns:cx6="http://schemas.microsoft.com/office/drawing/2016/5/12/chartex" xmlns:cx7="http://schemas.microsoft.com/office/drawing/2016/5/13/chartex" xmlns:cx8="http://schemas.microsoft.com/office/drawing/2016/5/14/chartex" xmlns:mc="http://schemas.openxmlformats.org/markup-compatibility/2006" xmlns:aink="http://schemas.microsoft.com/office/drawing/2016/ink" xmlns:am3d="http://schemas.microsoft.com/office/drawing/2017/model3d" xmlns:o="urn:schemas-microsoft-com:office:office" xmlns:oel="http://schemas.microsoft.com/office/2019/extlst" xmlns:r="http://schemas.openxmlformats.org/officeDocument/2006/relationships" xmlns:m="http://schemas.openxmlformats.org/officeDocument/2006/math" xmlns:v="urn:schemas-microsoft-com:vml" xmlns:wp14="http://schemas.microsoft.com/office/word/2010/wordprocessingDrawing" xmlns:wp="http://schemas.openxmlformats.org/drawingml/2006/wordprocessingDrawing" xmlns:w10="urn:schemas-microsoft-com:office:word" xmlns:w="http://schemas.openxmlformats.org/wordprocessingml/2006/main" xmlns:w14="http://schemas.microsoft.com/office/word/2010/wordml" xmlns:w15="http://schemas.microsoft.com/office/word/2012/wordml" xmlns:w16cex="http://schemas.microsoft.com/office/word/2018/wordml/cex" xmlns:w16cid="http://schemas.microsoft.com/office/word/2016/wordml/cid" xmlns:w16="http://schemas.microsoft.com/office/word/2018/wordml" xmlns:w16du="http://schemas.microsoft.com/office/word/2023/wordml/word16du" xmlns:w16sdtdh="http://schemas.microsoft.com/office/word/2020/wordml/sdtdatahash" xmlns:w16sdtfl="http://schemas.microsoft.com/office/word/2024/wordml/sdtformatlock" xmlns:w16se="http://schemas.microsoft.com/office/word/2015/wordml/symex" xmlns:wpg="http://schemas.microsoft.com/office/word/2010/wordprocessingGroup" xmlns:wpi="http://schemas.microsoft.com/office/word/2010/wordprocessingInk" xmlns:wne="http://schemas.microsoft.com/office/word/2006/wordml" xmlns:wps="http://schemas.microsoft.com/office/word/2010/wordprocessingShape" mc:Ignorable="w14 w15 w16se w16cid w16 w16cex w16sdtdh w16sdtfl w16du wp14">
+  <w:p>
+    <w:pPr>
+      <w:pStyle w:val="Footer"/>
     </w:pPr>
   </w:p>
 </w:ftr>
@@ -13949,135 +13287,7 @@
   <w:p>
     <w:pPr>
       <w:pStyle w:val="Header"/>
-      <w:rPr>
-        <w:rFonts w:asciiTheme="majorHAnsi" w:eastAsiaTheme="majorEastAsia" w:hAnsiTheme="majorHAnsi" w:cstheme="majorBidi"/>
-        <w:b/>
-        <w:bCs/>
-        <w:color w:val="EE0000"/>
-      </w:rPr>
     </w:pPr>
-    <w:r>
-      <w:rPr>
-        <w:rFonts w:asciiTheme="majorHAnsi" w:eastAsiaTheme="majorEastAsia" w:hAnsiTheme="majorHAnsi" w:cstheme="majorBidi"/>
-        <w:b/>
-        <w:bCs/>
-        <w:color w:val="EE0000"/>
-        <w:sz w:val="24"/>
-        <w:szCs w:val="24"/>
-      </w:rPr>
-      <w:t>Lab</w:t>
-    </w:r>
-    <w:r>
-      <w:rPr>
-        <w:rFonts w:asciiTheme="majorHAnsi" w:eastAsiaTheme="majorEastAsia" w:hAnsiTheme="majorHAnsi" w:cstheme="majorBidi"/>
-        <w:b/>
-        <w:bCs/>
-        <w:color w:val="EE0000"/>
-        <w:sz w:val="24"/>
-        <w:szCs w:val="24"/>
-      </w:rPr>
-      <w:t>_04</w:t>
-    </w:r>
-    <w:r>
-      <w:rPr>
-        <w:rFonts w:asciiTheme="majorHAnsi" w:eastAsiaTheme="majorEastAsia" w:hAnsiTheme="majorHAnsi" w:cstheme="majorBidi"/>
-        <w:b/>
-        <w:bCs/>
-        <w:color w:val="EE0000"/>
-        <w:sz w:val="24"/>
-        <w:szCs w:val="24"/>
-      </w:rPr>
-      <w:t xml:space="preserve"> Report</w:t>
-    </w:r>
-    <w:r>
-      <w:rPr>
-        <w:rFonts w:asciiTheme="majorHAnsi" w:eastAsiaTheme="majorEastAsia" w:hAnsiTheme="majorHAnsi" w:cstheme="majorBidi"/>
-        <w:b/>
-        <w:bCs/>
-        <w:color w:val="EE0000"/>
-        <w:sz w:val="24"/>
-        <w:szCs w:val="24"/>
-      </w:rPr>
-      <w:t>:</w:t>
-    </w:r>
-    <w:r>
-      <w:rPr>
-        <w:rFonts w:asciiTheme="majorHAnsi" w:eastAsiaTheme="majorEastAsia" w:hAnsiTheme="majorHAnsi" w:cstheme="majorBidi"/>
-        <w:b/>
-        <w:bCs/>
-        <w:color w:val="EE0000"/>
-        <w:sz w:val="24"/>
-        <w:szCs w:val="24"/>
-      </w:rPr>
-      <w:t xml:space="preserve"> </w:t>
-    </w:r>
-    <w:r>
-      <w:rPr>
-        <w:rFonts w:asciiTheme="majorHAnsi" w:eastAsiaTheme="majorEastAsia" w:hAnsiTheme="majorHAnsi" w:cstheme="majorBidi"/>
-        <w:b/>
-        <w:bCs/>
-        <w:color w:val="EE0000"/>
-      </w:rPr>
-      <w:t>Create RDD from a List</w:t>
-    </w:r>
-    <w:r>
-      <w:rPr>
-        <w:rFonts w:asciiTheme="majorHAnsi" w:eastAsiaTheme="majorEastAsia" w:hAnsiTheme="majorHAnsi" w:cstheme="majorBidi"/>
-        <w:b/>
-        <w:bCs/>
-        <w:color w:val="EE0000"/>
-      </w:rPr>
-      <w:t xml:space="preserve"> </w:t>
-    </w:r>
-    <w:r>
-      <w:rPr>
-        <w:rFonts w:asciiTheme="majorHAnsi" w:eastAsiaTheme="majorEastAsia" w:hAnsiTheme="majorHAnsi" w:cstheme="majorBidi"/>
-        <w:b/>
-        <w:bCs/>
-        <w:color w:val="EE0000"/>
-        <w:sz w:val="24"/>
-        <w:szCs w:val="24"/>
-      </w:rPr>
-      <w:ptab w:relativeTo="margin" w:alignment="right" w:leader="none"/>
-    </w:r>
-    <w:sdt>
-      <w:sdtPr>
-        <w:rPr>
-          <w:rFonts w:asciiTheme="majorHAnsi" w:eastAsiaTheme="majorEastAsia" w:hAnsiTheme="majorHAnsi" w:cstheme="majorBidi"/>
-          <w:b/>
-          <w:bCs/>
-          <w:color w:val="EE0000"/>
-          <w:sz w:val="24"/>
-          <w:szCs w:val="24"/>
-        </w:rPr>
-        <w:alias w:val="Date"/>
-        <w:id w:val="51587815"/>
-        <w:placeholder>
-          <w:docPart w:val="C96D6A1D370746B599C7E88CAB6EC703"/>
-        </w:placeholder>
-        <w:dataBinding w:prefixMappings="xmlns:ns0='http://schemas.microsoft.com/office/2006/coverPageProps'" w:xpath="/ns0:CoverPageProperties[1]/ns0:PublishDate[1]" w:storeItemID="{55AF091B-3C7A-41E3-B477-F2FDAA23CFDA}"/>
-        <w:date w:fullDate="2026-02-26T00:00:00Z">
-          <w:dateFormat w:val="MMMM d, yyyy"/>
-          <w:lid w:val="en-US"/>
-          <w:storeMappedDataAs w:val="dateTime"/>
-          <w:calendar w:val="gregorian"/>
-        </w:date>
-      </w:sdtPr>
-      <w:sdtContent>
-        <w:r>
-          <w:rPr>
-            <w:rFonts w:asciiTheme="majorHAnsi" w:eastAsiaTheme="majorEastAsia" w:hAnsiTheme="majorHAnsi" w:cstheme="majorBidi"/>
-            <w:b/>
-            <w:bCs/>
-            <w:color w:val="EE0000"/>
-            <w:sz w:val="24"/>
-            <w:szCs w:val="24"/>
-            <w:lang w:val="en-US"/>
-          </w:rPr>
-          <w:t>February 26, 2026</w:t>
-        </w:r>
-      </w:sdtContent>
-    </w:sdt>
   </w:p>
 </w:hdr>
 </file>
@@ -14088,12 +13298,49 @@
     <w:pPr>
       <w:pStyle w:val="Header"/>
       <w:rPr>
-        <w:rFonts w:asciiTheme="majorHAnsi" w:eastAsiaTheme="majorEastAsia" w:hAnsiTheme="majorHAnsi" w:cstheme="majorBidi"/>
-        <w:b/>
-        <w:bCs/>
-        <w:color w:val="EE0000"/>
+        <w:rFonts w:ascii="Cambria" w:eastAsiaTheme="majorEastAsia" w:hAnsi="Cambria" w:cstheme="majorBidi"/>
+        <w:color w:val="747474" w:themeColor="background2" w:themeShade="80"/>
       </w:rPr>
     </w:pPr>
+    <w:r>
+      <w:rPr>
+        <w:rFonts w:ascii="Cambria" w:eastAsiaTheme="majorEastAsia" w:hAnsi="Cambria" w:cs="Times New Roman"/>
+        <w:color w:val="747474" w:themeColor="background2" w:themeShade="80"/>
+        <w:spacing w:val="5"/>
+        <w:kern w:val="28"/>
+      </w:rPr>
+      <w:t>Multi-Level Fake Account Detection in Social Networks using Graph Centrality and GNNs</w:t>
+    </w:r>
+    <w:r>
+      <w:rPr>
+        <w:rFonts w:ascii="Cambria" w:eastAsiaTheme="majorEastAsia" w:hAnsi="Cambria" w:cs="Times New Roman"/>
+        <w:color w:val="747474" w:themeColor="background2" w:themeShade="80"/>
+        <w:spacing w:val="5"/>
+        <w:kern w:val="28"/>
+      </w:rPr>
+      <w:t xml:space="preserve"> Project Report</w:t>
+    </w:r>
+  </w:p>
+</w:hdr>
+</file>
+
+<file path=word/header3.xml><?xml version="1.0" encoding="utf-8"?>
+<w:hdr xmlns:wpc="http://schemas.microsoft.com/office/word/2010/wordprocessingCanvas" xmlns:cx="http://schemas.microsoft.com/office/drawing/2014/chartex" xmlns:cx1="http://schemas.microsoft.com/office/drawing/2015/9/8/chartex" xmlns:cx2="http://schemas.microsoft.com/office/drawing/2015/10/21/chartex" xmlns:cx3="http://schemas.microsoft.com/office/drawing/2016/5/9/chartex" xmlns:cx4="http://schemas.microsoft.com/office/drawing/2016/5/10/chartex" xmlns:cx5="http://schemas.microsoft.com/office/drawing/2016/5/11/chartex" xmlns:cx6="http://schemas.microsoft.com/office/drawing/2016/5/12/chartex" xmlns:cx7="http://schemas.microsoft.com/office/drawing/2016/5/13/chartex" xmlns:cx8="http://schemas.microsoft.com/office/drawing/2016/5/14/chartex" xmlns:mc="http://schemas.openxmlformats.org/markup-compatibility/2006" xmlns:aink="http://schemas.microsoft.com/office/drawing/2016/ink" xmlns:am3d="http://schemas.microsoft.com/office/drawing/2017/model3d" xmlns:o="urn:schemas-microsoft-com:office:office" xmlns:oel="http://schemas.microsoft.com/office/2019/extlst" xmlns:r="http://schemas.openxmlformats.org/officeDocument/2006/relationships" xmlns:m="http://schemas.openxmlformats.org/officeDocument/2006/math" xmlns:v="urn:schemas-microsoft-com:vml" xmlns:wp14="http://schemas.microsoft.com/office/word/2010/wordprocessingDrawing" xmlns:wp="http://schemas.openxmlformats.org/drawingml/2006/wordprocessingDrawing" xmlns:w10="urn:schemas-microsoft-com:office:word" xmlns:w="http://schemas.openxmlformats.org/wordprocessingml/2006/main" xmlns:w14="http://schemas.microsoft.com/office/word/2010/wordml" xmlns:w15="http://schemas.microsoft.com/office/word/2012/wordml" xmlns:w16cex="http://schemas.microsoft.com/office/word/2018/wordml/cex" xmlns:w16cid="http://schemas.microsoft.com/office/word/2016/wordml/cid" xmlns:w16="http://schemas.microsoft.com/office/word/2018/wordml" xmlns:w16du="http://schemas.microsoft.com/office/word/2023/wordml/word16du" xmlns:w16sdtdh="http://schemas.microsoft.com/office/word/2020/wordml/sdtdatahash" xmlns:w16sdtfl="http://schemas.microsoft.com/office/word/2024/wordml/sdtformatlock" xmlns:w16se="http://schemas.microsoft.com/office/word/2015/wordml/symex" xmlns:wpg="http://schemas.microsoft.com/office/word/2010/wordprocessingGroup" xmlns:wpi="http://schemas.microsoft.com/office/word/2010/wordprocessingInk" xmlns:wne="http://schemas.microsoft.com/office/word/2006/wordml" xmlns:wps="http://schemas.microsoft.com/office/word/2010/wordprocessingShape" mc:Ignorable="w14 w15 w16se w16cid w16 w16cex w16sdtdh w16sdtfl w16du wp14">
+  <w:p>
+    <w:pPr>
+      <w:pStyle w:val="Header"/>
+      <w:rPr>
+        <w:rFonts w:ascii="Cambria" w:hAnsi="Cambria"/>
+        <w:color w:val="747474" w:themeColor="background2" w:themeShade="80"/>
+      </w:rPr>
+    </w:pPr>
+    <w:r>
+      <w:rPr>
+        <w:rFonts w:ascii="Cambria" w:hAnsi="Cambria"/>
+        <w:color w:val="747474" w:themeColor="background2" w:themeShade="80"/>
+      </w:rPr>
+      <w:t>Multi-Level Fake Account Detection in Social Networks using Graph Centrality and GNNs</w:t>
+    </w:r>
   </w:p>
 </w:hdr>
 </file>
@@ -21927,700 +21174,6 @@
 </w:styles>
 </file>
 
-<file path=word/glossary/document.xml><?xml version="1.0" encoding="utf-8"?>
-<w:glossaryDocument xmlns:wpc="http://schemas.microsoft.com/office/word/2010/wordprocessingCanvas" xmlns:cx="http://schemas.microsoft.com/office/drawing/2014/chartex" xmlns:cx1="http://schemas.microsoft.com/office/drawing/2015/9/8/chartex" xmlns:cx2="http://schemas.microsoft.com/office/drawing/2015/10/21/chartex" xmlns:cx3="http://schemas.microsoft.com/office/drawing/2016/5/9/chartex" xmlns:cx4="http://schemas.microsoft.com/office/drawing/2016/5/10/chartex" xmlns:cx5="http://schemas.microsoft.com/office/drawing/2016/5/11/chartex" xmlns:cx6="http://schemas.microsoft.com/office/drawing/2016/5/12/chartex" xmlns:cx7="http://schemas.microsoft.com/office/drawing/2016/5/13/chartex" xmlns:cx8="http://schemas.microsoft.com/office/drawing/2016/5/14/chartex" xmlns:mc="http://schemas.openxmlformats.org/markup-compatibility/2006" xmlns:aink="http://schemas.microsoft.com/office/drawing/2016/ink" xmlns:am3d="http://schemas.microsoft.com/office/drawing/2017/model3d" xmlns:o="urn:schemas-microsoft-com:office:office" xmlns:oel="http://schemas.microsoft.com/office/2019/extlst" xmlns:r="http://schemas.openxmlformats.org/officeDocument/2006/relationships" xmlns:m="http://schemas.openxmlformats.org/officeDocument/2006/math" xmlns:v="urn:schemas-microsoft-com:vml" xmlns:wp14="http://schemas.microsoft.com/office/word/2010/wordprocessingDrawing" xmlns:wp="http://schemas.openxmlformats.org/drawingml/2006/wordprocessingDrawing" xmlns:w10="urn:schemas-microsoft-com:office:word" xmlns:w="http://schemas.openxmlformats.org/wordprocessingml/2006/main" xmlns:w14="http://schemas.microsoft.com/office/word/2010/wordml" xmlns:w15="http://schemas.microsoft.com/office/word/2012/wordml" xmlns:w16cex="http://schemas.microsoft.com/office/word/2018/wordml/cex" xmlns:w16cid="http://schemas.microsoft.com/office/word/2016/wordml/cid" xmlns:w16="http://schemas.microsoft.com/office/word/2018/wordml" xmlns:w16du="http://schemas.microsoft.com/office/word/2023/wordml/word16du" xmlns:w16sdtdh="http://schemas.microsoft.com/office/word/2020/wordml/sdtdatahash" xmlns:w16sdtfl="http://schemas.microsoft.com/office/word/2024/wordml/sdtformatlock" xmlns:w16se="http://schemas.microsoft.com/office/word/2015/wordml/symex" xmlns:wpg="http://schemas.microsoft.com/office/word/2010/wordprocessingGroup" xmlns:wpi="http://schemas.microsoft.com/office/word/2010/wordprocessingInk" xmlns:wne="http://schemas.microsoft.com/office/word/2006/wordml" xmlns:wps="http://schemas.microsoft.com/office/word/2010/wordprocessingShape" mc:Ignorable="w14 w15 w16se w16cid w16 w16cex w16sdtdh w16sdtfl w16du wp14">
-  <w:docParts>
-    <w:docPart>
-      <w:docPartPr>
-        <w:name w:val="C96D6A1D370746B599C7E88CAB6EC703"/>
-        <w:category>
-          <w:name w:val="General"/>
-          <w:gallery w:val="placeholder"/>
-        </w:category>
-        <w:types>
-          <w:type w:val="bbPlcHdr"/>
-        </w:types>
-        <w:behaviors>
-          <w:behavior w:val="content"/>
-        </w:behaviors>
-        <w:guid w:val="{2C6075AE-3062-41C5-A591-524D88A45FE1}"/>
-      </w:docPartPr>
-      <w:docPartBody>
-        <w:p>
-          <w:pPr>
-            <w:pStyle w:val="C96D6A1D370746B599C7E88CAB6EC703"/>
-          </w:pPr>
-          <w:r>
-            <w:rPr>
-              <w:rFonts w:asciiTheme="majorHAnsi" w:eastAsiaTheme="majorEastAsia" w:hAnsiTheme="majorHAnsi" w:cstheme="majorBidi"/>
-              <w:color w:val="156082" w:themeColor="accent1"/>
-              <w:sz w:val="27"/>
-              <w:szCs w:val="27"/>
-            </w:rPr>
-            <w:t>[Date]</w:t>
-          </w:r>
-        </w:p>
-      </w:docPartBody>
-    </w:docPart>
-  </w:docParts>
-</w:glossaryDocument>
-</file>
-
-<file path=word/glossary/fontTable.xml><?xml version="1.0" encoding="utf-8"?>
-<w:fonts xmlns:mc="http://schemas.openxmlformats.org/markup-compatibility/2006" xmlns:r="http://schemas.openxmlformats.org/officeDocument/2006/relationships" xmlns:w="http://schemas.openxmlformats.org/wordprocessingml/2006/main" xmlns:w14="http://schemas.microsoft.com/office/word/2010/wordml" xmlns:w15="http://schemas.microsoft.com/office/word/2012/wordml" xmlns:w16cex="http://schemas.microsoft.com/office/word/2018/wordml/cex" xmlns:w16cid="http://schemas.microsoft.com/office/word/2016/wordml/cid" xmlns:w16="http://schemas.microsoft.com/office/word/2018/wordml" xmlns:w16du="http://schemas.microsoft.com/office/word/2023/wordml/word16du" xmlns:w16sdtdh="http://schemas.microsoft.com/office/word/2020/wordml/sdtdatahash" xmlns:w16sdtfl="http://schemas.microsoft.com/office/word/2024/wordml/sdtformatlock" xmlns:w16se="http://schemas.microsoft.com/office/word/2015/wordml/symex" mc:Ignorable="w14 w15 w16se w16cid w16 w16cex w16sdtdh w16sdtfl w16du">
-  <w:font w:name="Symbol">
-    <w:panose1 w:val="05050102010706020507"/>
-    <w:charset w:val="02"/>
-    <w:family w:val="roman"/>
-    <w:pitch w:val="variable"/>
-    <w:sig w:usb0="00000000" w:usb1="10000000" w:usb2="00000000" w:usb3="00000000" w:csb0="80000000" w:csb1="00000000"/>
-  </w:font>
-  <w:font w:name="Times New Roman">
-    <w:panose1 w:val="02020603050405020304"/>
-    <w:charset w:val="00"/>
-    <w:family w:val="roman"/>
-    <w:pitch w:val="variable"/>
-    <w:sig w:usb0="E0002EFF" w:usb1="C000785B" w:usb2="00000009" w:usb3="00000000" w:csb0="000001FF" w:csb1="00000000"/>
-  </w:font>
-  <w:font w:name="Courier New">
-    <w:panose1 w:val="02070309020205020404"/>
-    <w:charset w:val="00"/>
-    <w:family w:val="modern"/>
-    <w:pitch w:val="fixed"/>
-    <w:sig w:usb0="E0002EFF" w:usb1="C0007843" w:usb2="00000009" w:usb3="00000000" w:csb0="000001FF" w:csb1="00000000"/>
-  </w:font>
-  <w:font w:name="Wingdings">
-    <w:panose1 w:val="05000000000000000000"/>
-    <w:charset w:val="02"/>
-    <w:family w:val="auto"/>
-    <w:pitch w:val="variable"/>
-    <w:sig w:usb0="00000000" w:usb1="10000000" w:usb2="00000000" w:usb3="00000000" w:csb0="80000000" w:csb1="00000000"/>
-  </w:font>
-  <w:font w:name="Wingdings 3">
-    <w:panose1 w:val="05040102010807070707"/>
-    <w:charset w:val="02"/>
-    <w:family w:val="roman"/>
-    <w:pitch w:val="variable"/>
-    <w:sig w:usb0="00000000" w:usb1="10000000" w:usb2="00000000" w:usb3="00000000" w:csb0="80000000" w:csb1="00000000"/>
-  </w:font>
-  <w:font w:name="Aptos">
-    <w:charset w:val="00"/>
-    <w:family w:val="swiss"/>
-    <w:pitch w:val="variable"/>
-    <w:sig w:usb0="20000287" w:usb1="00000003" w:usb2="00000000" w:usb3="00000000" w:csb0="0000019F" w:csb1="00000000"/>
-  </w:font>
-  <w:font w:name="Shruti">
-    <w:panose1 w:val="02000500000000000000"/>
-    <w:charset w:val="00"/>
-    <w:family w:val="swiss"/>
-    <w:pitch w:val="variable"/>
-    <w:sig w:usb0="00040003" w:usb1="00000000" w:usb2="00000000" w:usb3="00000000" w:csb0="00000001" w:csb1="00000000"/>
-  </w:font>
-  <w:font w:name="Latha">
-    <w:panose1 w:val="02000400000000000000"/>
-    <w:charset w:val="00"/>
-    <w:family w:val="swiss"/>
-    <w:pitch w:val="variable"/>
-    <w:sig w:usb0="00100003" w:usb1="00000000" w:usb2="00000000" w:usb3="00000000" w:csb0="00000001" w:csb1="00000000"/>
-  </w:font>
-  <w:font w:name="Aptos Display">
-    <w:charset w:val="00"/>
-    <w:family w:val="swiss"/>
-    <w:pitch w:val="variable"/>
-    <w:sig w:usb0="20000287" w:usb1="00000003" w:usb2="00000000" w:usb3="00000000" w:csb0="0000019F" w:csb1="00000000"/>
-  </w:font>
-  <w:font w:name="Trebuchet MS">
-    <w:panose1 w:val="020B0603020202020204"/>
-    <w:charset w:val="00"/>
-    <w:family w:val="swiss"/>
-    <w:pitch w:val="variable"/>
-    <w:sig w:usb0="00000687" w:usb1="00000000" w:usb2="00000000" w:usb3="00000000" w:csb0="0000009F" w:csb1="00000000"/>
-  </w:font>
-  <w:font w:name="Arial Black">
-    <w:panose1 w:val="020B0A04020102020204"/>
-    <w:charset w:val="00"/>
-    <w:family w:val="swiss"/>
-    <w:pitch w:val="variable"/>
-    <w:sig w:usb0="A00002AF" w:usb1="400078FB" w:usb2="00000000" w:usb3="00000000" w:csb0="0000009F" w:csb1="00000000"/>
-  </w:font>
-  <w:font w:name="Century Gothic">
-    <w:panose1 w:val="020B0502020202020204"/>
-    <w:charset w:val="00"/>
-    <w:family w:val="swiss"/>
-    <w:pitch w:val="variable"/>
-    <w:sig w:usb0="00000287" w:usb1="00000000" w:usb2="00000000" w:usb3="00000000" w:csb0="0000009F" w:csb1="00000000"/>
-  </w:font>
-  <w:font w:name="Cambria">
-    <w:panose1 w:val="02040503050406030204"/>
-    <w:charset w:val="00"/>
-    <w:family w:val="roman"/>
-    <w:pitch w:val="variable"/>
-    <w:sig w:usb0="E00006FF" w:usb1="420024FF" w:usb2="02000000" w:usb3="00000000" w:csb0="0000019F" w:csb1="00000000"/>
-  </w:font>
-  <w:font w:name="Tisa Offc Serif Pro">
-    <w:charset w:val="00"/>
-    <w:family w:val="auto"/>
-    <w:pitch w:val="variable"/>
-    <w:sig w:usb0="800002E7" w:usb1="00000002" w:usb2="00000000" w:usb3="00000000" w:csb0="0000019F" w:csb1="00000000"/>
-  </w:font>
-  <w:font w:name="Cambria Math">
-    <w:panose1 w:val="02040503050406030204"/>
-    <w:charset w:val="00"/>
-    <w:family w:val="roman"/>
-    <w:pitch w:val="variable"/>
-    <w:sig w:usb0="E00006FF" w:usb1="420024FF" w:usb2="02000000" w:usb3="00000000" w:csb0="0000019F" w:csb1="00000000"/>
-  </w:font>
-  <w:font w:name="Segoe UI Emoji">
-    <w:panose1 w:val="020B0502040204020203"/>
-    <w:charset w:val="00"/>
-    <w:family w:val="swiss"/>
-    <w:pitch w:val="variable"/>
-    <w:sig w:usb0="00000003" w:usb1="02000000" w:usb2="08000000" w:usb3="00000000" w:csb0="00000001" w:csb1="00000000"/>
-  </w:font>
-</w:fonts>
-</file>
-
-<file path=word/glossary/settings.xml><?xml version="1.0" encoding="utf-8"?>
-<w:settings xmlns:mc="http://schemas.openxmlformats.org/markup-compatibility/2006" xmlns:o="urn:schemas-microsoft-com:office:office" xmlns:r="http://schemas.openxmlformats.org/officeDocument/2006/relationships" xmlns:m="http://schemas.openxmlformats.org/officeDocument/2006/math" xmlns:v="urn:schemas-microsoft-com:vml" xmlns:w10="urn:schemas-microsoft-com:office:word" xmlns:w="http://schemas.openxmlformats.org/wordprocessingml/2006/main" xmlns:w14="http://schemas.microsoft.com/office/word/2010/wordml" xmlns:w15="http://schemas.microsoft.com/office/word/2012/wordml" xmlns:w16cex="http://schemas.microsoft.com/office/word/2018/wordml/cex" xmlns:w16cid="http://schemas.microsoft.com/office/word/2016/wordml/cid" xmlns:w16="http://schemas.microsoft.com/office/word/2018/wordml" xmlns:w16du="http://schemas.microsoft.com/office/word/2023/wordml/word16du" xmlns:w16sdtdh="http://schemas.microsoft.com/office/word/2020/wordml/sdtdatahash" xmlns:w16sdtfl="http://schemas.microsoft.com/office/word/2024/wordml/sdtformatlock" xmlns:w16se="http://schemas.microsoft.com/office/word/2015/wordml/symex" xmlns:sl="http://schemas.openxmlformats.org/schemaLibrary/2006/main" mc:Ignorable="w14 w15 w16se w16cid w16 w16cex w16sdtdh w16sdtfl w16du">
-  <w:view w:val="normal"/>
-  <w:defaultTabStop w:val="720"/>
-  <w:characterSpacingControl w:val="doNotCompress"/>
-  <w:compat>
-    <w:useFELayout/>
-    <w:compatSetting w:name="compatibilityMode" w:uri="http://schemas.microsoft.com/office/word" w:val="15"/>
-    <w:compatSetting w:name="overrideTableStyleFontSizeAndJustification" w:uri="http://schemas.microsoft.com/office/word" w:val="1"/>
-    <w:compatSetting w:name="enableOpenTypeFeatures" w:uri="http://schemas.microsoft.com/office/word" w:val="1"/>
-    <w:compatSetting w:name="doNotFlipMirrorIndents" w:uri="http://schemas.microsoft.com/office/word" w:val="1"/>
-    <w:compatSetting w:name="differentiateMultirowTableHeaders" w:uri="http://schemas.microsoft.com/office/word" w:val="1"/>
-    <w:compatSetting w:name="useWord2013TrackBottomHyphenation" w:uri="http://schemas.microsoft.com/office/word" w:val="0"/>
-  </w:compat>
-  <w:rsids>
-    <w:rsidRoot w:val="00C903FD"/>
-    <w:rsid w:val="00001A72"/>
-    <w:rsid w:val="00044880"/>
-    <w:rsid w:val="00150C67"/>
-    <w:rsid w:val="00161B43"/>
-    <w:rsid w:val="001706BD"/>
-    <w:rsid w:val="00171FF2"/>
-    <w:rsid w:val="001A3E89"/>
-    <w:rsid w:val="001C7CDC"/>
-    <w:rsid w:val="001D37C7"/>
-    <w:rsid w:val="0025132C"/>
-    <w:rsid w:val="0026209C"/>
-    <w:rsid w:val="00295DB2"/>
-    <w:rsid w:val="002B5A70"/>
-    <w:rsid w:val="002B74F4"/>
-    <w:rsid w:val="002D22AA"/>
-    <w:rsid w:val="002E2DEE"/>
-    <w:rsid w:val="002F3B00"/>
-    <w:rsid w:val="002F3EF7"/>
-    <w:rsid w:val="00377A7F"/>
-    <w:rsid w:val="003F5C42"/>
-    <w:rsid w:val="003F7AB4"/>
-    <w:rsid w:val="00414071"/>
-    <w:rsid w:val="004474AB"/>
-    <w:rsid w:val="004B4EC9"/>
-    <w:rsid w:val="004C48F0"/>
-    <w:rsid w:val="004D1172"/>
-    <w:rsid w:val="004D4318"/>
-    <w:rsid w:val="004E5A7D"/>
-    <w:rsid w:val="00572D80"/>
-    <w:rsid w:val="005824EA"/>
-    <w:rsid w:val="005A3FA4"/>
-    <w:rsid w:val="0061148F"/>
-    <w:rsid w:val="00692855"/>
-    <w:rsid w:val="006A2B30"/>
-    <w:rsid w:val="006A51AA"/>
-    <w:rsid w:val="006B5461"/>
-    <w:rsid w:val="006E0607"/>
-    <w:rsid w:val="00707DF9"/>
-    <w:rsid w:val="00794038"/>
-    <w:rsid w:val="007C1297"/>
-    <w:rsid w:val="008C32BD"/>
-    <w:rsid w:val="0092312A"/>
-    <w:rsid w:val="00982288"/>
-    <w:rsid w:val="00A23784"/>
-    <w:rsid w:val="00AA4CB8"/>
-    <w:rsid w:val="00AB4BE4"/>
-    <w:rsid w:val="00AE0F7F"/>
-    <w:rsid w:val="00B2438B"/>
-    <w:rsid w:val="00BC1F8F"/>
-    <w:rsid w:val="00BD7076"/>
-    <w:rsid w:val="00C903FD"/>
-    <w:rsid w:val="00C93ED6"/>
-    <w:rsid w:val="00CA35E7"/>
-    <w:rsid w:val="00CD364F"/>
-    <w:rsid w:val="00D919E3"/>
-    <w:rsid w:val="00DE545E"/>
-    <w:rsid w:val="00E10830"/>
-    <w:rsid w:val="00E46747"/>
-    <w:rsid w:val="00EA2819"/>
-    <w:rsid w:val="00F97847"/>
-    <w:rsid w:val="00FC03C5"/>
-  </w:rsids>
-  <m:mathPr>
-    <m:mathFont m:val="Cambria Math"/>
-    <m:brkBin m:val="before"/>
-    <m:brkBinSub m:val="--"/>
-    <m:smallFrac m:val="0"/>
-    <m:dispDef/>
-    <m:lMargin m:val="0"/>
-    <m:rMargin m:val="0"/>
-    <m:defJc m:val="centerGroup"/>
-    <m:wrapIndent m:val="1440"/>
-    <m:intLim m:val="subSup"/>
-    <m:naryLim m:val="undOvr"/>
-  </m:mathPr>
-  <w:themeFontLang w:val="en-IN" w:bidi="gu-IN"/>
-  <w:clrSchemeMapping w:bg1="light1" w:t1="dark1" w:bg2="light2" w:t2="dark2" w:accent1="accent1" w:accent2="accent2" w:accent3="accent3" w:accent4="accent4" w:accent5="accent5" w:accent6="accent6" w:hyperlink="hyperlink" w:followedHyperlink="followedHyperlink"/>
-  <w:decimalSymbol w:val="."/>
-  <w:listSeparator w:val=","/>
-  <w15:chartTrackingRefBased/>
-</w:settings>
-</file>
-
-<file path=word/glossary/styles.xml><?xml version="1.0" encoding="utf-8"?>
-<w:styles xmlns:mc="http://schemas.openxmlformats.org/markup-compatibility/2006" xmlns:r="http://schemas.openxmlformats.org/officeDocument/2006/relationships" xmlns:w="http://schemas.openxmlformats.org/wordprocessingml/2006/main" xmlns:w14="http://schemas.microsoft.com/office/word/2010/wordml" xmlns:w15="http://schemas.microsoft.com/office/word/2012/wordml" xmlns:w16cex="http://schemas.microsoft.com/office/word/2018/wordml/cex" xmlns:w16cid="http://schemas.microsoft.com/office/word/2016/wordml/cid" xmlns:w16="http://schemas.microsoft.com/office/word/2018/wordml" xmlns:w16du="http://schemas.microsoft.com/office/word/2023/wordml/word16du" xmlns:w16sdtdh="http://schemas.microsoft.com/office/word/2020/wordml/sdtdatahash" xmlns:w16sdtfl="http://schemas.microsoft.com/office/word/2024/wordml/sdtformatlock" xmlns:w16se="http://schemas.microsoft.com/office/word/2015/wordml/symex" mc:Ignorable="w14 w15 w16se w16cid w16 w16cex w16sdtdh w16sdtfl w16du">
-  <w:docDefaults>
-    <w:rPrDefault>
-      <w:rPr>
-        <w:rFonts w:asciiTheme="minorHAnsi" w:eastAsiaTheme="minorEastAsia" w:hAnsiTheme="minorHAnsi" w:cstheme="minorBidi"/>
-        <w:kern w:val="2"/>
-        <w:sz w:val="24"/>
-        <w:szCs w:val="24"/>
-        <w:lang w:val="en-IN" w:eastAsia="en-IN" w:bidi="gu-IN"/>
-        <w14:ligatures w14:val="standardContextual"/>
-      </w:rPr>
-    </w:rPrDefault>
-    <w:pPrDefault>
-      <w:pPr>
-        <w:spacing w:after="160" w:line="278" w:lineRule="auto"/>
-      </w:pPr>
-    </w:pPrDefault>
-  </w:docDefaults>
-  <w:latentStyles w:defLockedState="0" w:defUIPriority="99" w:defSemiHidden="0" w:defUnhideWhenUsed="0" w:defQFormat="0" w:count="376">
-    <w:lsdException w:name="Normal" w:uiPriority="0" w:qFormat="1"/>
-    <w:lsdException w:name="heading 1" w:uiPriority="9" w:qFormat="1"/>
-    <w:lsdException w:name="heading 2" w:semiHidden="1" w:uiPriority="9" w:unhideWhenUsed="1" w:qFormat="1"/>
-    <w:lsdException w:name="heading 3" w:semiHidden="1" w:uiPriority="9" w:unhideWhenUsed="1" w:qFormat="1"/>
-    <w:lsdException w:name="heading 4" w:semiHidden="1" w:uiPriority="9" w:unhideWhenUsed="1" w:qFormat="1"/>
-    <w:lsdException w:name="heading 5" w:semiHidden="1" w:uiPriority="9" w:unhideWhenUsed="1" w:qFormat="1"/>
-    <w:lsdException w:name="heading 6" w:semiHidden="1" w:uiPriority="9" w:unhideWhenUsed="1" w:qFormat="1"/>
-    <w:lsdException w:name="heading 7" w:semiHidden="1" w:uiPriority="9" w:unhideWhenUsed="1" w:qFormat="1"/>
-    <w:lsdException w:name="heading 8" w:semiHidden="1" w:uiPriority="9" w:unhideWhenUsed="1" w:qFormat="1"/>
-    <w:lsdException w:name="heading 9" w:semiHidden="1" w:uiPriority="9" w:unhideWhenUsed="1" w:qFormat="1"/>
-    <w:lsdException w:name="index 1" w:semiHidden="1" w:unhideWhenUsed="1"/>
-    <w:lsdException w:name="index 2" w:semiHidden="1" w:unhideWhenUsed="1"/>
-    <w:lsdException w:name="index 3" w:semiHidden="1" w:unhideWhenUsed="1"/>
-    <w:lsdException w:name="index 4" w:semiHidden="1" w:unhideWhenUsed="1"/>
-    <w:lsdException w:name="index 5" w:semiHidden="1" w:unhideWhenUsed="1"/>
-    <w:lsdException w:name="index 6" w:semiHidden="1" w:unhideWhenUsed="1"/>
-    <w:lsdException w:name="index 7" w:semiHidden="1" w:unhideWhenUsed="1"/>
-    <w:lsdException w:name="index 8" w:semiHidden="1" w:unhideWhenUsed="1"/>
-    <w:lsdException w:name="index 9" w:semiHidden="1" w:unhideWhenUsed="1"/>
-    <w:lsdException w:name="toc 1" w:semiHidden="1" w:uiPriority="39" w:unhideWhenUsed="1"/>
-    <w:lsdException w:name="toc 2" w:semiHidden="1" w:uiPriority="39" w:unhideWhenUsed="1"/>
-    <w:lsdException w:name="toc 3" w:semiHidden="1" w:uiPriority="39" w:unhideWhenUsed="1"/>
-    <w:lsdException w:name="toc 4" w:semiHidden="1" w:uiPriority="39" w:unhideWhenUsed="1"/>
-    <w:lsdException w:name="toc 5" w:semiHidden="1" w:uiPriority="39" w:unhideWhenUsed="1"/>
-    <w:lsdException w:name="toc 6" w:semiHidden="1" w:uiPriority="39" w:unhideWhenUsed="1"/>
-    <w:lsdException w:name="toc 7" w:semiHidden="1" w:uiPriority="39" w:unhideWhenUsed="1"/>
-    <w:lsdException w:name="toc 8" w:semiHidden="1" w:uiPriority="39" w:unhideWhenUsed="1"/>
-    <w:lsdException w:name="toc 9" w:semiHidden="1" w:uiPriority="39" w:unhideWhenUsed="1"/>
-    <w:lsdException w:name="Normal Indent" w:semiHidden="1" w:unhideWhenUsed="1"/>
-    <w:lsdException w:name="footnote text" w:semiHidden="1" w:unhideWhenUsed="1"/>
-    <w:lsdException w:name="annotation text" w:semiHidden="1" w:unhideWhenUsed="1"/>
-    <w:lsdException w:name="header" w:semiHidden="1" w:unhideWhenUsed="1"/>
-    <w:lsdException w:name="footer" w:semiHidden="1" w:unhideWhenUsed="1"/>
-    <w:lsdException w:name="index heading" w:semiHidden="1" w:unhideWhenUsed="1"/>
-    <w:lsdException w:name="caption" w:semiHidden="1" w:uiPriority="35" w:unhideWhenUsed="1" w:qFormat="1"/>
-    <w:lsdException w:name="table of figures" w:semiHidden="1" w:unhideWhenUsed="1"/>
-    <w:lsdException w:name="envelope address" w:semiHidden="1" w:unhideWhenUsed="1"/>
-    <w:lsdException w:name="envelope return" w:semiHidden="1" w:unhideWhenUsed="1"/>
-    <w:lsdException w:name="footnote reference" w:semiHidden="1" w:unhideWhenUsed="1"/>
-    <w:lsdException w:name="annotation reference" w:semiHidden="1" w:unhideWhenUsed="1"/>
-    <w:lsdException w:name="line number" w:semiHidden="1" w:unhideWhenUsed="1"/>
-    <w:lsdException w:name="page number" w:semiHidden="1" w:unhideWhenUsed="1"/>
-    <w:lsdException w:name="endnote reference" w:semiHidden="1" w:unhideWhenUsed="1"/>
-    <w:lsdException w:name="endnote text" w:semiHidden="1" w:unhideWhenUsed="1"/>
-    <w:lsdException w:name="table of authorities" w:semiHidden="1" w:unhideWhenUsed="1"/>
-    <w:lsdException w:name="macro" w:semiHidden="1" w:unhideWhenUsed="1"/>
-    <w:lsdException w:name="toa heading" w:semiHidden="1" w:unhideWhenUsed="1"/>
-    <w:lsdException w:name="List" w:semiHidden="1" w:unhideWhenUsed="1"/>
-    <w:lsdException w:name="List Bullet" w:semiHidden="1" w:unhideWhenUsed="1"/>
-    <w:lsdException w:name="List Number" w:semiHidden="1" w:unhideWhenUsed="1"/>
-    <w:lsdException w:name="List 2" w:semiHidden="1" w:unhideWhenUsed="1"/>
-    <w:lsdException w:name="List 3" w:semiHidden="1" w:unhideWhenUsed="1"/>
-    <w:lsdException w:name="List 4" w:semiHidden="1" w:unhideWhenUsed="1"/>
-    <w:lsdException w:name="List 5" w:semiHidden="1" w:unhideWhenUsed="1"/>
-    <w:lsdException w:name="List Bullet 2" w:semiHidden="1" w:unhideWhenUsed="1"/>
-    <w:lsdException w:name="List Bullet 3" w:semiHidden="1" w:unhideWhenUsed="1"/>
-    <w:lsdException w:name="List Bullet 4" w:semiHidden="1" w:unhideWhenUsed="1"/>
-    <w:lsdException w:name="List Bullet 5" w:semiHidden="1" w:unhideWhenUsed="1"/>
-    <w:lsdException w:name="List Number 2" w:semiHidden="1" w:unhideWhenUsed="1"/>
-    <w:lsdException w:name="List Number 3" w:semiHidden="1" w:unhideWhenUsed="1"/>
-    <w:lsdException w:name="List Number 4" w:semiHidden="1" w:unhideWhenUsed="1"/>
-    <w:lsdException w:name="List Number 5" w:semiHidden="1" w:unhideWhenUsed="1"/>
-    <w:lsdException w:name="Title" w:uiPriority="10" w:qFormat="1"/>
-    <w:lsdException w:name="Closing" w:semiHidden="1" w:unhideWhenUsed="1"/>
-    <w:lsdException w:name="Signature" w:semiHidden="1" w:unhideWhenUsed="1"/>
-    <w:lsdException w:name="Default Paragraph Font" w:semiHidden="1" w:uiPriority="1" w:unhideWhenUsed="1"/>
-    <w:lsdException w:name="Body Text" w:semiHidden="1" w:unhideWhenUsed="1"/>
-    <w:lsdException w:name="Body Text Indent" w:semiHidden="1" w:unhideWhenUsed="1"/>
-    <w:lsdException w:name="List Continue" w:semiHidden="1" w:unhideWhenUsed="1"/>
-    <w:lsdException w:name="List Continue 2" w:semiHidden="1" w:unhideWhenUsed="1"/>
-    <w:lsdException w:name="List Continue 3" w:semiHidden="1" w:unhideWhenUsed="1"/>
-    <w:lsdException w:name="List Continue 4" w:semiHidden="1" w:unhideWhenUsed="1"/>
-    <w:lsdException w:name="List Continue 5" w:semiHidden="1" w:unhideWhenUsed="1"/>
-    <w:lsdException w:name="Message Header" w:semiHidden="1" w:unhideWhenUsed="1"/>
-    <w:lsdException w:name="Subtitle" w:uiPriority="11" w:qFormat="1"/>
-    <w:lsdException w:name="Salutation" w:semiHidden="1" w:unhideWhenUsed="1"/>
-    <w:lsdException w:name="Date" w:semiHidden="1" w:unhideWhenUsed="1"/>
-    <w:lsdException w:name="Body Text First Indent" w:semiHidden="1" w:unhideWhenUsed="1"/>
-    <w:lsdException w:name="Body Text First Indent 2" w:semiHidden="1" w:unhideWhenUsed="1"/>
-    <w:lsdException w:name="Note Heading" w:semiHidden="1" w:unhideWhenUsed="1"/>
-    <w:lsdException w:name="Body Text 2" w:semiHidden="1" w:unhideWhenUsed="1"/>
-    <w:lsdException w:name="Body Text 3" w:semiHidden="1" w:unhideWhenUsed="1"/>
-    <w:lsdException w:name="Body Text Indent 2" w:semiHidden="1" w:unhideWhenUsed="1"/>
-    <w:lsdException w:name="Body Text Indent 3" w:semiHidden="1" w:unhideWhenUsed="1"/>
-    <w:lsdException w:name="Block Text" w:semiHidden="1" w:unhideWhenUsed="1"/>
-    <w:lsdException w:name="Hyperlink" w:semiHidden="1" w:unhideWhenUsed="1"/>
-    <w:lsdException w:name="FollowedHyperlink" w:semiHidden="1" w:unhideWhenUsed="1"/>
-    <w:lsdException w:name="Strong" w:uiPriority="22" w:qFormat="1"/>
-    <w:lsdException w:name="Emphasis" w:uiPriority="20" w:qFormat="1"/>
-    <w:lsdException w:name="Document Map" w:semiHidden="1" w:unhideWhenUsed="1"/>
-    <w:lsdException w:name="Plain Text" w:semiHidden="1" w:unhideWhenUsed="1"/>
-    <w:lsdException w:name="E-mail Signature" w:semiHidden="1" w:unhideWhenUsed="1"/>
-    <w:lsdException w:name="HTML Top of Form" w:semiHidden="1" w:unhideWhenUsed="1"/>
-    <w:lsdException w:name="HTML Bottom of Form" w:semiHidden="1" w:unhideWhenUsed="1"/>
-    <w:lsdException w:name="Normal (Web)" w:semiHidden="1" w:unhideWhenUsed="1"/>
-    <w:lsdException w:name="HTML Acronym" w:semiHidden="1" w:unhideWhenUsed="1"/>
-    <w:lsdException w:name="HTML Address" w:semiHidden="1" w:unhideWhenUsed="1"/>
-    <w:lsdException w:name="HTML Cite" w:semiHidden="1" w:unhideWhenUsed="1"/>
-    <w:lsdException w:name="HTML Code" w:semiHidden="1" w:unhideWhenUsed="1"/>
-    <w:lsdException w:name="HTML Definition" w:semiHidden="1" w:unhideWhenUsed="1"/>
-    <w:lsdException w:name="HTML Keyboard" w:semiHidden="1" w:unhideWhenUsed="1"/>
-    <w:lsdException w:name="HTML Preformatted" w:semiHidden="1" w:unhideWhenUsed="1"/>
-    <w:lsdException w:name="HTML Sample" w:semiHidden="1" w:unhideWhenUsed="1"/>
-    <w:lsdException w:name="HTML Typewriter" w:semiHidden="1" w:unhideWhenUsed="1"/>
-    <w:lsdException w:name="HTML Variable" w:semiHidden="1" w:unhideWhenUsed="1"/>
-    <w:lsdException w:name="Normal Table" w:semiHidden="1" w:unhideWhenUsed="1"/>
-    <w:lsdException w:name="annotation subject" w:semiHidden="1" w:unhideWhenUsed="1"/>
-    <w:lsdException w:name="No List" w:semiHidden="1" w:unhideWhenUsed="1"/>
-    <w:lsdException w:name="Outline List 1" w:semiHidden="1" w:unhideWhenUsed="1"/>
-    <w:lsdException w:name="Outline List 2" w:semiHidden="1" w:unhideWhenUsed="1"/>
-    <w:lsdException w:name="Outline List 3" w:semiHidden="1" w:unhideWhenUsed="1"/>
-    <w:lsdException w:name="Table Simple 1" w:semiHidden="1" w:unhideWhenUsed="1"/>
-    <w:lsdException w:name="Table Simple 2" w:semiHidden="1" w:unhideWhenUsed="1"/>
-    <w:lsdException w:name="Table Simple 3" w:semiHidden="1" w:unhideWhenUsed="1"/>
-    <w:lsdException w:name="Table Classic 1" w:semiHidden="1" w:unhideWhenUsed="1"/>
-    <w:lsdException w:name="Table Classic 2" w:semiHidden="1" w:unhideWhenUsed="1"/>
-    <w:lsdException w:name="Table Classic 3" w:semiHidden="1" w:unhideWhenUsed="1"/>
-    <w:lsdException w:name="Table Classic 4" w:semiHidden="1" w:unhideWhenUsed="1"/>
-    <w:lsdException w:name="Table Colorful 1" w:semiHidden="1" w:unhideWhenUsed="1"/>
-    <w:lsdException w:name="Table Colorful 2" w:semiHidden="1" w:unhideWhenUsed="1"/>
-    <w:lsdException w:name="Table Colorful 3" w:semiHidden="1" w:unhideWhenUsed="1"/>
-    <w:lsdException w:name="Table Columns 1" w:semiHidden="1" w:unhideWhenUsed="1"/>
-    <w:lsdException w:name="Table Columns 2" w:semiHidden="1" w:unhideWhenUsed="1"/>
-    <w:lsdException w:name="Table Columns 3" w:semiHidden="1" w:unhideWhenUsed="1"/>
-    <w:lsdException w:name="Table Columns 4" w:semiHidden="1" w:unhideWhenUsed="1"/>
-    <w:lsdException w:name="Table Columns 5" w:semiHidden="1" w:unhideWhenUsed="1"/>
-    <w:lsdException w:name="Table Grid 1" w:semiHidden="1" w:unhideWhenUsed="1"/>
-    <w:lsdException w:name="Table Grid 2" w:semiHidden="1" w:unhideWhenUsed="1"/>
-    <w:lsdException w:name="Table Grid 3" w:semiHidden="1" w:unhideWhenUsed="1"/>
-    <w:lsdException w:name="Table Grid 4" w:semiHidden="1" w:unhideWhenUsed="1"/>
-    <w:lsdException w:name="Table Grid 5" w:semiHidden="1" w:unhideWhenUsed="1"/>
-    <w:lsdException w:name="Table Grid 6" w:semiHidden="1" w:unhideWhenUsed="1"/>
-    <w:lsdException w:name="Table Grid 7" w:semiHidden="1" w:unhideWhenUsed="1"/>
-    <w:lsdException w:name="Table Grid 8" w:semiHidden="1" w:unhideWhenUsed="1"/>
-    <w:lsdException w:name="Table List 1" w:semiHidden="1" w:unhideWhenUsed="1"/>
-    <w:lsdException w:name="Table List 2" w:semiHidden="1" w:unhideWhenUsed="1"/>
-    <w:lsdException w:name="Table List 3" w:semiHidden="1" w:unhideWhenUsed="1"/>
-    <w:lsdException w:name="Table List 4" w:semiHidden="1" w:unhideWhenUsed="1"/>
-    <w:lsdException w:name="Table List 5" w:semiHidden="1" w:unhideWhenUsed="1"/>
-    <w:lsdException w:name="Table List 6" w:semiHidden="1" w:unhideWhenUsed="1"/>
-    <w:lsdException w:name="Table List 7" w:semiHidden="1" w:unhideWhenUsed="1"/>
-    <w:lsdException w:name="Table List 8" w:semiHidden="1" w:unhideWhenUsed="1"/>
-    <w:lsdException w:name="Table 3D effects 1" w:semiHidden="1" w:unhideWhenUsed="1"/>
-    <w:lsdException w:name="Table 3D effects 2" w:semiHidden="1" w:unhideWhenUsed="1"/>
-    <w:lsdException w:name="Table 3D effects 3" w:semiHidden="1" w:unhideWhenUsed="1"/>
-    <w:lsdException w:name="Table Contemporary" w:semiHidden="1" w:unhideWhenUsed="1"/>
-    <w:lsdException w:name="Table Elegant" w:semiHidden="1" w:unhideWhenUsed="1"/>
-    <w:lsdException w:name="Table Professional" w:semiHidden="1" w:unhideWhenUsed="1"/>
-    <w:lsdException w:name="Table Subtle 1" w:semiHidden="1" w:unhideWhenUsed="1"/>
-    <w:lsdException w:name="Table Subtle 2" w:semiHidden="1" w:unhideWhenUsed="1"/>
-    <w:lsdException w:name="Table Web 1" w:semiHidden="1" w:unhideWhenUsed="1"/>
-    <w:lsdException w:name="Table Web 2" w:semiHidden="1" w:unhideWhenUsed="1"/>
-    <w:lsdException w:name="Table Web 3" w:semiHidden="1" w:unhideWhenUsed="1"/>
-    <w:lsdException w:name="Balloon Text" w:semiHidden="1" w:unhideWhenUsed="1"/>
-    <w:lsdException w:name="Table Grid" w:uiPriority="39"/>
-    <w:lsdException w:name="Table Theme" w:semiHidden="1" w:unhideWhenUsed="1"/>
-    <w:lsdException w:name="Placeholder Text" w:semiHidden="1"/>
-    <w:lsdException w:name="No Spacing" w:uiPriority="1" w:qFormat="1"/>
-    <w:lsdException w:name="Light Shading" w:uiPriority="60"/>
-    <w:lsdException w:name="Light List" w:uiPriority="61"/>
-    <w:lsdException w:name="Light Grid" w:uiPriority="62"/>
-    <w:lsdException w:name="Medium Shading 1" w:uiPriority="63"/>
-    <w:lsdException w:name="Medium Shading 2" w:uiPriority="64"/>
-    <w:lsdException w:name="Medium List 1" w:uiPriority="65"/>
-    <w:lsdException w:name="Medium List 2" w:uiPriority="66"/>
-    <w:lsdException w:name="Medium Grid 1" w:uiPriority="67"/>
-    <w:lsdException w:name="Medium Grid 2" w:uiPriority="68"/>
-    <w:lsdException w:name="Medium Grid 3" w:uiPriority="69"/>
-    <w:lsdException w:name="Dark List" w:uiPriority="70"/>
-    <w:lsdException w:name="Colorful Shading" w:uiPriority="71"/>
-    <w:lsdException w:name="Colorful List" w:uiPriority="72"/>
-    <w:lsdException w:name="Colorful Grid" w:uiPriority="73"/>
-    <w:lsdException w:name="Light Shading Accent 1" w:uiPriority="60"/>
-    <w:lsdException w:name="Light List Accent 1" w:uiPriority="61"/>
-    <w:lsdException w:name="Light Grid Accent 1" w:uiPriority="62"/>
-    <w:lsdException w:name="Medium Shading 1 Accent 1" w:uiPriority="63"/>
-    <w:lsdException w:name="Medium Shading 2 Accent 1" w:uiPriority="64"/>
-    <w:lsdException w:name="Medium List 1 Accent 1" w:uiPriority="65"/>
-    <w:lsdException w:name="Revision" w:semiHidden="1"/>
-    <w:lsdException w:name="List Paragraph" w:uiPriority="34" w:qFormat="1"/>
-    <w:lsdException w:name="Quote" w:uiPriority="29" w:qFormat="1"/>
-    <w:lsdException w:name="Intense Quote" w:uiPriority="30" w:qFormat="1"/>
-    <w:lsdException w:name="Medium List 2 Accent 1" w:uiPriority="66"/>
-    <w:lsdException w:name="Medium Grid 1 Accent 1" w:uiPriority="67"/>
-    <w:lsdException w:name="Medium Grid 2 Accent 1" w:uiPriority="68"/>
-    <w:lsdException w:name="Medium Grid 3 Accent 1" w:uiPriority="69"/>
-    <w:lsdException w:name="Dark List Accent 1" w:uiPriority="70"/>
-    <w:lsdException w:name="Colorful Shading Accent 1" w:uiPriority="71"/>
-    <w:lsdException w:name="Colorful List Accent 1" w:uiPriority="72"/>
-    <w:lsdException w:name="Colorful Grid Accent 1" w:uiPriority="73"/>
-    <w:lsdException w:name="Light Shading Accent 2" w:uiPriority="60"/>
-    <w:lsdException w:name="Light List Accent 2" w:uiPriority="61"/>
-    <w:lsdException w:name="Light Grid Accent 2" w:uiPriority="62"/>
-    <w:lsdException w:name="Medium Shading 1 Accent 2" w:uiPriority="63"/>
-    <w:lsdException w:name="Medium Shading 2 Accent 2" w:uiPriority="64"/>
-    <w:lsdException w:name="Medium List 1 Accent 2" w:uiPriority="65"/>
-    <w:lsdException w:name="Medium List 2 Accent 2" w:uiPriority="66"/>
-    <w:lsdException w:name="Medium Grid 1 Accent 2" w:uiPriority="67"/>
-    <w:lsdException w:name="Medium Grid 2 Accent 2" w:uiPriority="68"/>
-    <w:lsdException w:name="Medium Grid 3 Accent 2" w:uiPriority="69"/>
-    <w:lsdException w:name="Dark List Accent 2" w:uiPriority="70"/>
-    <w:lsdException w:name="Colorful Shading Accent 2" w:uiPriority="71"/>
-    <w:lsdException w:name="Colorful List Accent 2" w:uiPriority="72"/>
-    <w:lsdException w:name="Colorful Grid Accent 2" w:uiPriority="73"/>
-    <w:lsdException w:name="Light Shading Accent 3" w:uiPriority="60"/>
-    <w:lsdException w:name="Light List Accent 3" w:uiPriority="61"/>
-    <w:lsdException w:name="Light Grid Accent 3" w:uiPriority="62"/>
-    <w:lsdException w:name="Medium Shading 1 Accent 3" w:uiPriority="63"/>
-    <w:lsdException w:name="Medium Shading 2 Accent 3" w:uiPriority="64"/>
-    <w:lsdException w:name="Medium List 1 Accent 3" w:uiPriority="65"/>
-    <w:lsdException w:name="Medium List 2 Accent 3" w:uiPriority="66"/>
-    <w:lsdException w:name="Medium Grid 1 Accent 3" w:uiPriority="67"/>
-    <w:lsdException w:name="Medium Grid 2 Accent 3" w:uiPriority="68"/>
-    <w:lsdException w:name="Medium Grid 3 Accent 3" w:uiPriority="69"/>
-    <w:lsdException w:name="Dark List Accent 3" w:uiPriority="70"/>
-    <w:lsdException w:name="Colorful Shading Accent 3" w:uiPriority="71"/>
-    <w:lsdException w:name="Colorful List Accent 3" w:uiPriority="72"/>
-    <w:lsdException w:name="Colorful Grid Accent 3" w:uiPriority="73"/>
-    <w:lsdException w:name="Light Shading Accent 4" w:uiPriority="60"/>
-    <w:lsdException w:name="Light List Accent 4" w:uiPriority="61"/>
-    <w:lsdException w:name="Light Grid Accent 4" w:uiPriority="62"/>
-    <w:lsdException w:name="Medium Shading 1 Accent 4" w:uiPriority="63"/>
-    <w:lsdException w:name="Medium Shading 2 Accent 4" w:uiPriority="64"/>
-    <w:lsdException w:name="Medium List 1 Accent 4" w:uiPriority="65"/>
-    <w:lsdException w:name="Medium List 2 Accent 4" w:uiPriority="66"/>
-    <w:lsdException w:name="Medium Grid 1 Accent 4" w:uiPriority="67"/>
-    <w:lsdException w:name="Medium Grid 2 Accent 4" w:uiPriority="68"/>
-    <w:lsdException w:name="Medium Grid 3 Accent 4" w:uiPriority="69"/>
-    <w:lsdException w:name="Dark List Accent 4" w:uiPriority="70"/>
-    <w:lsdException w:name="Colorful Shading Accent 4" w:uiPriority="71"/>
-    <w:lsdException w:name="Colorful List Accent 4" w:uiPriority="72"/>
-    <w:lsdException w:name="Colorful Grid Accent 4" w:uiPriority="73"/>
-    <w:lsdException w:name="Light Shading Accent 5" w:uiPriority="60"/>
-    <w:lsdException w:name="Light List Accent 5" w:uiPriority="61"/>
-    <w:lsdException w:name="Light Grid Accent 5" w:uiPriority="62"/>
-    <w:lsdException w:name="Medium Shading 1 Accent 5" w:uiPriority="63"/>
-    <w:lsdException w:name="Medium Shading 2 Accent 5" w:uiPriority="64"/>
-    <w:lsdException w:name="Medium List 1 Accent 5" w:uiPriority="65"/>
-    <w:lsdException w:name="Medium List 2 Accent 5" w:uiPriority="66"/>
-    <w:lsdException w:name="Medium Grid 1 Accent 5" w:uiPriority="67"/>
-    <w:lsdException w:name="Medium Grid 2 Accent 5" w:uiPriority="68"/>
-    <w:lsdException w:name="Medium Grid 3 Accent 5" w:uiPriority="69"/>
-    <w:lsdException w:name="Dark List Accent 5" w:uiPriority="70"/>
-    <w:lsdException w:name="Colorful Shading Accent 5" w:uiPriority="71"/>
-    <w:lsdException w:name="Colorful List Accent 5" w:uiPriority="72"/>
-    <w:lsdException w:name="Colorful Grid Accent 5" w:uiPriority="73"/>
-    <w:lsdException w:name="Light Shading Accent 6" w:uiPriority="60"/>
-    <w:lsdException w:name="Light List Accent 6" w:uiPriority="61"/>
-    <w:lsdException w:name="Light Grid Accent 6" w:uiPriority="62"/>
-    <w:lsdException w:name="Medium Shading 1 Accent 6" w:uiPriority="63"/>
-    <w:lsdException w:name="Medium Shading 2 Accent 6" w:uiPriority="64"/>
-    <w:lsdException w:name="Medium List 1 Accent 6" w:uiPriority="65"/>
-    <w:lsdException w:name="Medium List 2 Accent 6" w:uiPriority="66"/>
-    <w:lsdException w:name="Medium Grid 1 Accent 6" w:uiPriority="67"/>
-    <w:lsdException w:name="Medium Grid 2 Accent 6" w:uiPriority="68"/>
-    <w:lsdException w:name="Medium Grid 3 Accent 6" w:uiPriority="69"/>
-    <w:lsdException w:name="Dark List Accent 6" w:uiPriority="70"/>
-    <w:lsdException w:name="Colorful Shading Accent 6" w:uiPriority="71"/>
-    <w:lsdException w:name="Colorful List Accent 6" w:uiPriority="72"/>
-    <w:lsdException w:name="Colorful Grid Accent 6" w:uiPriority="73"/>
-    <w:lsdException w:name="Subtle Emphasis" w:uiPriority="19" w:qFormat="1"/>
-    <w:lsdException w:name="Intense Emphasis" w:uiPriority="21" w:qFormat="1"/>
-    <w:lsdException w:name="Subtle Reference" w:uiPriority="31" w:qFormat="1"/>
-    <w:lsdException w:name="Intense Reference" w:uiPriority="32" w:qFormat="1"/>
-    <w:lsdException w:name="Book Title" w:uiPriority="33" w:qFormat="1"/>
-    <w:lsdException w:name="Bibliography" w:semiHidden="1" w:uiPriority="37" w:unhideWhenUsed="1"/>
-    <w:lsdException w:name="TOC Heading" w:semiHidden="1" w:uiPriority="39" w:unhideWhenUsed="1" w:qFormat="1"/>
-    <w:lsdException w:name="Plain Table 1" w:uiPriority="41"/>
-    <w:lsdException w:name="Plain Table 2" w:uiPriority="42"/>
-    <w:lsdException w:name="Plain Table 3" w:uiPriority="43"/>
-    <w:lsdException w:name="Plain Table 4" w:uiPriority="44"/>
-    <w:lsdException w:name="Plain Table 5" w:uiPriority="45"/>
-    <w:lsdException w:name="Grid Table Light" w:uiPriority="40"/>
-    <w:lsdException w:name="Grid Table 1 Light" w:uiPriority="46"/>
-    <w:lsdException w:name="Grid Table 2" w:uiPriority="47"/>
-    <w:lsdException w:name="Grid Table 3" w:uiPriority="48"/>
-    <w:lsdException w:name="Grid Table 4" w:uiPriority="49"/>
-    <w:lsdException w:name="Grid Table 5 Dark" w:uiPriority="50"/>
-    <w:lsdException w:name="Grid Table 6 Colorful" w:uiPriority="51"/>
-    <w:lsdException w:name="Grid Table 7 Colorful" w:uiPriority="52"/>
-    <w:lsdException w:name="Grid Table 1 Light Accent 1" w:uiPriority="46"/>
-    <w:lsdException w:name="Grid Table 2 Accent 1" w:uiPriority="47"/>
-    <w:lsdException w:name="Grid Table 3 Accent 1" w:uiPriority="48"/>
-    <w:lsdException w:name="Grid Table 4 Accent 1" w:uiPriority="49"/>
-    <w:lsdException w:name="Grid Table 5 Dark Accent 1" w:uiPriority="50"/>
-    <w:lsdException w:name="Grid Table 6 Colorful Accent 1" w:uiPriority="51"/>
-    <w:lsdException w:name="Grid Table 7 Colorful Accent 1" w:uiPriority="52"/>
-    <w:lsdException w:name="Grid Table 1 Light Accent 2" w:uiPriority="46"/>
-    <w:lsdException w:name="Grid Table 2 Accent 2" w:uiPriority="47"/>
-    <w:lsdException w:name="Grid Table 3 Accent 2" w:uiPriority="48"/>
-    <w:lsdException w:name="Grid Table 4 Accent 2" w:uiPriority="49"/>
-    <w:lsdException w:name="Grid Table 5 Dark Accent 2" w:uiPriority="50"/>
-    <w:lsdException w:name="Grid Table 6 Colorful Accent 2" w:uiPriority="51"/>
-    <w:lsdException w:name="Grid Table 7 Colorful Accent 2" w:uiPriority="52"/>
-    <w:lsdException w:name="Grid Table 1 Light Accent 3" w:uiPriority="46"/>
-    <w:lsdException w:name="Grid Table 2 Accent 3" w:uiPriority="47"/>
-    <w:lsdException w:name="Grid Table 3 Accent 3" w:uiPriority="48"/>
-    <w:lsdException w:name="Grid Table 4 Accent 3" w:uiPriority="49"/>
-    <w:lsdException w:name="Grid Table 5 Dark Accent 3" w:uiPriority="50"/>
-    <w:lsdException w:name="Grid Table 6 Colorful Accent 3" w:uiPriority="51"/>
-    <w:lsdException w:name="Grid Table 7 Colorful Accent 3" w:uiPriority="52"/>
-    <w:lsdException w:name="Grid Table 1 Light Accent 4" w:uiPriority="46"/>
-    <w:lsdException w:name="Grid Table 2 Accent 4" w:uiPriority="47"/>
-    <w:lsdException w:name="Grid Table 3 Accent 4" w:uiPriority="48"/>
-    <w:lsdException w:name="Grid Table 4 Accent 4" w:uiPriority="49"/>
-    <w:lsdException w:name="Grid Table 5 Dark Accent 4" w:uiPriority="50"/>
-    <w:lsdException w:name="Grid Table 6 Colorful Accent 4" w:uiPriority="51"/>
-    <w:lsdException w:name="Grid Table 7 Colorful Accent 4" w:uiPriority="52"/>
-    <w:lsdException w:name="Grid Table 1 Light Accent 5" w:uiPriority="46"/>
-    <w:lsdException w:name="Grid Table 2 Accent 5" w:uiPriority="47"/>
-    <w:lsdException w:name="Grid Table 3 Accent 5" w:uiPriority="48"/>
-    <w:lsdException w:name="Grid Table 4 Accent 5" w:uiPriority="49"/>
-    <w:lsdException w:name="Grid Table 5 Dark Accent 5" w:uiPriority="50"/>
-    <w:lsdException w:name="Grid Table 6 Colorful Accent 5" w:uiPriority="51"/>
-    <w:lsdException w:name="Grid Table 7 Colorful Accent 5" w:uiPriority="52"/>
-    <w:lsdException w:name="Grid Table 1 Light Accent 6" w:uiPriority="46"/>
-    <w:lsdException w:name="Grid Table 2 Accent 6" w:uiPriority="47"/>
-    <w:lsdException w:name="Grid Table 3 Accent 6" w:uiPriority="48"/>
-    <w:lsdException w:name="Grid Table 4 Accent 6" w:uiPriority="49"/>
-    <w:lsdException w:name="Grid Table 5 Dark Accent 6" w:uiPriority="50"/>
-    <w:lsdException w:name="Grid Table 6 Colorful Accent 6" w:uiPriority="51"/>
-    <w:lsdException w:name="Grid Table 7 Colorful Accent 6" w:uiPriority="52"/>
-    <w:lsdException w:name="List Table 1 Light" w:uiPriority="46"/>
-    <w:lsdException w:name="List Table 2" w:uiPriority="47"/>
-    <w:lsdException w:name="List Table 3" w:uiPriority="48"/>
-    <w:lsdException w:name="List Table 4" w:uiPriority="49"/>
-    <w:lsdException w:name="List Table 5 Dark" w:uiPriority="50"/>
-    <w:lsdException w:name="List Table 6 Colorful" w:uiPriority="51"/>
-    <w:lsdException w:name="List Table 7 Colorful" w:uiPriority="52"/>
-    <w:lsdException w:name="List Table 1 Light Accent 1" w:uiPriority="46"/>
-    <w:lsdException w:name="List Table 2 Accent 1" w:uiPriority="47"/>
-    <w:lsdException w:name="List Table 3 Accent 1" w:uiPriority="48"/>
-    <w:lsdException w:name="List Table 4 Accent 1" w:uiPriority="49"/>
-    <w:lsdException w:name="List Table 5 Dark Accent 1" w:uiPriority="50"/>
-    <w:lsdException w:name="List Table 6 Colorful Accent 1" w:uiPriority="51"/>
-    <w:lsdException w:name="List Table 7 Colorful Accent 1" w:uiPriority="52"/>
-    <w:lsdException w:name="List Table 1 Light Accent 2" w:uiPriority="46"/>
-    <w:lsdException w:name="List Table 2 Accent 2" w:uiPriority="47"/>
-    <w:lsdException w:name="List Table 3 Accent 2" w:uiPriority="48"/>
-    <w:lsdException w:name="List Table 4 Accent 2" w:uiPriority="49"/>
-    <w:lsdException w:name="List Table 5 Dark Accent 2" w:uiPriority="50"/>
-    <w:lsdException w:name="List Table 6 Colorful Accent 2" w:uiPriority="51"/>
-    <w:lsdException w:name="List Table 7 Colorful Accent 2" w:uiPriority="52"/>
-    <w:lsdException w:name="List Table 1 Light Accent 3" w:uiPriority="46"/>
-    <w:lsdException w:name="List Table 2 Accent 3" w:uiPriority="47"/>
-    <w:lsdException w:name="List Table 3 Accent 3" w:uiPriority="48"/>
-    <w:lsdException w:name="List Table 4 Accent 3" w:uiPriority="49"/>
-    <w:lsdException w:name="List Table 5 Dark Accent 3" w:uiPriority="50"/>
-    <w:lsdException w:name="List Table 6 Colorful Accent 3" w:uiPriority="51"/>
-    <w:lsdException w:name="List Table 7 Colorful Accent 3" w:uiPriority="52"/>
-    <w:lsdException w:name="List Table 1 Light Accent 4" w:uiPriority="46"/>
-    <w:lsdException w:name="List Table 2 Accent 4" w:uiPriority="47"/>
-    <w:lsdException w:name="List Table 3 Accent 4" w:uiPriority="48"/>
-    <w:lsdException w:name="List Table 4 Accent 4" w:uiPriority="49"/>
-    <w:lsdException w:name="List Table 5 Dark Accent 4" w:uiPriority="50"/>
-    <w:lsdException w:name="List Table 6 Colorful Accent 4" w:uiPriority="51"/>
-    <w:lsdException w:name="List Table 7 Colorful Accent 4" w:uiPriority="52"/>
-    <w:lsdException w:name="List Table 1 Light Accent 5" w:uiPriority="46"/>
-    <w:lsdException w:name="List Table 2 Accent 5" w:uiPriority="47"/>
-    <w:lsdException w:name="List Table 3 Accent 5" w:uiPriority="48"/>
-    <w:lsdException w:name="List Table 4 Accent 5" w:uiPriority="49"/>
-    <w:lsdException w:name="List Table 5 Dark Accent 5" w:uiPriority="50"/>
-    <w:lsdException w:name="List Table 6 Colorful Accent 5" w:uiPriority="51"/>
-    <w:lsdException w:name="List Table 7 Colorful Accent 5" w:uiPriority="52"/>
-    <w:lsdException w:name="List Table 1 Light Accent 6" w:uiPriority="46"/>
-    <w:lsdException w:name="List Table 2 Accent 6" w:uiPriority="47"/>
-    <w:lsdException w:name="List Table 3 Accent 6" w:uiPriority="48"/>
-    <w:lsdException w:name="List Table 4 Accent 6" w:uiPriority="49"/>
-    <w:lsdException w:name="List Table 5 Dark Accent 6" w:uiPriority="50"/>
-    <w:lsdException w:name="List Table 6 Colorful Accent 6" w:uiPriority="51"/>
-    <w:lsdException w:name="List Table 7 Colorful Accent 6" w:uiPriority="52"/>
-    <w:lsdException w:name="Mention" w:semiHidden="1" w:unhideWhenUsed="1"/>
-    <w:lsdException w:name="Smart Hyperlink" w:semiHidden="1" w:unhideWhenUsed="1"/>
-    <w:lsdException w:name="Hashtag" w:semiHidden="1" w:unhideWhenUsed="1"/>
-    <w:lsdException w:name="Unresolved Mention" w:semiHidden="1" w:unhideWhenUsed="1"/>
-    <w:lsdException w:name="Smart Link" w:semiHidden="1" w:unhideWhenUsed="1"/>
-  </w:latentStyles>
-  <w:style w:type="paragraph" w:default="1" w:styleId="Normal">
-    <w:name w:val="Normal"/>
-    <w:qFormat/>
-  </w:style>
-  <w:style w:type="character" w:default="1" w:styleId="DefaultParagraphFont">
-    <w:name w:val="Default Paragraph Font"/>
-    <w:uiPriority w:val="1"/>
-    <w:semiHidden/>
-    <w:unhideWhenUsed/>
-  </w:style>
-  <w:style w:type="table" w:default="1" w:styleId="TableNormal">
-    <w:name w:val="Normal Table"/>
-    <w:uiPriority w:val="99"/>
-    <w:semiHidden/>
-    <w:unhideWhenUsed/>
-    <w:tblPr>
-      <w:tblInd w:w="0" w:type="dxa"/>
-      <w:tblCellMar>
-        <w:top w:w="0" w:type="dxa"/>
-        <w:left w:w="108" w:type="dxa"/>
-        <w:bottom w:w="0" w:type="dxa"/>
-        <w:right w:w="108" w:type="dxa"/>
-      </w:tblCellMar>
-    </w:tblPr>
-  </w:style>
-  <w:style w:type="numbering" w:default="1" w:styleId="NoList">
-    <w:name w:val="No List"/>
-    <w:uiPriority w:val="99"/>
-    <w:semiHidden/>
-    <w:unhideWhenUsed/>
-  </w:style>
-  <w:style w:type="paragraph" w:customStyle="1" w:styleId="C96D6A1D370746B599C7E88CAB6EC703">
-    <w:name w:val="C96D6A1D370746B599C7E88CAB6EC703"/>
-    <w:rsid w:val="00C903FD"/>
-  </w:style>
-</w:styles>
-</file>
-
-<file path=word/glossary/webSettings.xml><?xml version="1.0" encoding="utf-8"?>
-<w:webSettings xmlns:mc="http://schemas.openxmlformats.org/markup-compatibility/2006" xmlns:r="http://schemas.openxmlformats.org/officeDocument/2006/relationships" xmlns:w="http://schemas.openxmlformats.org/wordprocessingml/2006/main" xmlns:w14="http://schemas.microsoft.com/office/word/2010/wordml" xmlns:w15="http://schemas.microsoft.com/office/word/2012/wordml" xmlns:w16cex="http://schemas.microsoft.com/office/word/2018/wordml/cex" xmlns:w16cid="http://schemas.microsoft.com/office/word/2016/wordml/cid" xmlns:w16="http://schemas.microsoft.com/office/word/2018/wordml" xmlns:w16du="http://schemas.microsoft.com/office/word/2023/wordml/word16du" xmlns:w16sdtdh="http://schemas.microsoft.com/office/word/2020/wordml/sdtdatahash" xmlns:w16sdtfl="http://schemas.microsoft.com/office/word/2024/wordml/sdtformatlock" xmlns:w16se="http://schemas.microsoft.com/office/word/2015/wordml/symex" mc:Ignorable="w14 w15 w16se w16cid w16 w16cex w16sdtdh w16sdtfl w16du">
-  <w:optimizeForBrowser/>
-  <w:allowPNG/>
-</w:webSettings>
-</file>
-
 <file path=word/theme/theme1.xml><?xml version="1.0" encoding="utf-8"?>
 <a:theme xmlns:a="http://schemas.openxmlformats.org/drawingml/2006/main" name="Office Theme">
   <a:themeElements>

</xml_diff>